<commit_message>
feat: implement settings module with document template management and SPPD numbering configuration
</commit_message>
<xml_diff>
--- a/templates/sppd_template.docx
+++ b/templates/sppd_template.docx
@@ -4,38 +4,21 @@
   <w:body>
     <w:p>
       <w:pPr>
-        <w:suppressAutoHyphens/>
-        <w:autoSpaceDN w:val="0"/>
-        <w:spacing w:after="0" w:line="240" w:lineRule="auto"/>
-        <w:ind w:left="1560"/>
-        <w:jc w:val="center"/>
+        <w:pStyle w:val="HeaderSurat"/>
+        <w:ind w:left="0"/>
         <w:rPr>
-          <w:rFonts w:ascii="Bookman Old Style" w:eastAsia="Times New Roman" w:hAnsi="Bookman Old Style" w:cs="Times New Roman"/>
-          <w:caps/>
           <w:noProof/>
-          <w:kern w:val="0"/>
-          <w:sz w:val="32"/>
-          <w:szCs w:val="32"/>
-          <w:lang w:val="en-US"/>
-          <w14:ligatures w14:val="none"/>
         </w:rPr>
       </w:pPr>
       <w:r>
         <w:rPr>
-          <w:rFonts w:ascii="Bookman Old Style" w:eastAsia="Times New Roman" w:hAnsi="Bookman Old Style" w:cs="Times New Roman"/>
-          <w:caps/>
           <w:noProof/>
-          <w:kern w:val="0"/>
-          <w:sz w:val="32"/>
-          <w:szCs w:val="32"/>
-          <w:lang w:val="en-US"/>
-          <w14:ligatures w14:val="none"/>
         </w:rPr>
         <w:drawing>
-          <wp:anchor distT="0" distB="0" distL="114300" distR="114300" simplePos="0" relativeHeight="251659264" behindDoc="1" locked="0" layoutInCell="1" allowOverlap="1" wp14:anchorId="12526810" wp14:editId="3258EEE4">
+          <wp:anchor distT="0" distB="0" distL="114300" distR="114300" simplePos="0" relativeHeight="251663360" behindDoc="1" locked="0" layoutInCell="1" allowOverlap="1" wp14:anchorId="747E7F54" wp14:editId="33E7A257">
             <wp:simplePos x="0" y="0"/>
             <wp:positionH relativeFrom="column">
-              <wp:posOffset>-258750</wp:posOffset>
+              <wp:posOffset>-327804</wp:posOffset>
             </wp:positionH>
             <wp:positionV relativeFrom="paragraph">
               <wp:posOffset>0</wp:posOffset>
@@ -43,7 +26,7 @@
             <wp:extent cx="975360" cy="975360"/>
             <wp:effectExtent l="0" t="0" r="0" b="0"/>
             <wp:wrapNone/>
-            <wp:docPr id="7" name="Picture 1"/>
+            <wp:docPr id="1" name="Picture 1" descr="A green shield with a red and yellow logo&#10;&#10;AI-generated content may be incorrect."/>
             <wp:cNvGraphicFramePr>
               <a:graphicFrameLocks xmlns:a="http://schemas.openxmlformats.org/drawingml/2006/main" noChangeAspect="1"/>
             </wp:cNvGraphicFramePr>
@@ -51,7 +34,7 @@
               <a:graphicData uri="http://schemas.openxmlformats.org/drawingml/2006/picture">
                 <pic:pic xmlns:pic="http://schemas.openxmlformats.org/drawingml/2006/picture">
                   <pic:nvPicPr>
-                    <pic:cNvPr id="0" name="Picture 1"/>
+                    <pic:cNvPr id="1" name="Picture 1" descr="A green shield with a red and yellow logo&#10;&#10;AI-generated content may be incorrect."/>
                     <pic:cNvPicPr>
                       <a:picLocks noChangeAspect="1" noChangeArrowheads="1"/>
                     </pic:cNvPicPr>
@@ -78,6 +61,9 @@
                       <a:avLst/>
                     </a:prstGeom>
                     <a:noFill/>
+                    <a:ln>
+                      <a:noFill/>
+                    </a:ln>
                   </pic:spPr>
                 </pic:pic>
               </a:graphicData>
@@ -93,474 +79,143 @@
       </w:r>
       <w:r>
         <w:rPr>
-          <w:rFonts w:ascii="Bookman Old Style" w:eastAsia="Times New Roman" w:hAnsi="Bookman Old Style" w:cs="Times New Roman"/>
-          <w:caps/>
           <w:noProof/>
-          <w:kern w:val="0"/>
-          <w:sz w:val="32"/>
-          <w:szCs w:val="32"/>
-          <w:lang w:val="en-US"/>
-          <w14:ligatures w14:val="none"/>
         </w:rPr>
-        <w:t xml:space="preserve">PEMERINTAH </w:t>
+        <w:t>PEMERINTAH KABUPATEN Magelang</w:t>
       </w:r>
+    </w:p>
+    <w:p>
+      <w:pPr>
+        <w:pStyle w:val="HeaderSurat"/>
+        <w:ind w:left="0"/>
+      </w:pPr>
+      <w:r>
+        <w:t>KECAMATAN Borobudur</w:t>
+      </w:r>
+    </w:p>
+    <w:p>
+      <w:pPr>
+        <w:pStyle w:val="HeaderSurat"/>
+        <w:ind w:left="0"/>
+        <w:rPr>
+          <w:b/>
+          <w:bCs/>
+        </w:rPr>
+      </w:pPr>
       <w:r>
         <w:rPr>
-          <w:rFonts w:ascii="Bookman Old Style" w:eastAsia="Times New Roman" w:hAnsi="Bookman Old Style" w:cs="Times New Roman"/>
-          <w:caps/>
-          <w:noProof/>
-          <w:kern w:val="0"/>
-          <w:sz w:val="32"/>
-          <w:szCs w:val="32"/>
-          <w:lang w:val="en-US"/>
-          <w14:ligatures w14:val="none"/>
+          <w:b/>
+          <w:bCs/>
         </w:rPr>
-        <w:t>KABUPATEN</w:t>
+        <w:t>desa Kembanglimus</w:t>
       </w:r>
+    </w:p>
+    <w:p>
+      <w:pPr>
+        <w:pStyle w:val="HeaderSurat"/>
+        <w:ind w:left="0"/>
+        <w:rPr>
+          <w:caps w:val="0"/>
+          <w:sz w:val="20"/>
+          <w:szCs w:val="20"/>
+        </w:rPr>
+      </w:pPr>
       <w:r>
         <w:rPr>
-          <w:rFonts w:ascii="Bookman Old Style" w:eastAsia="Times New Roman" w:hAnsi="Bookman Old Style" w:cs="Times New Roman"/>
-          <w:caps/>
-          <w:noProof/>
-          <w:kern w:val="0"/>
-          <w:sz w:val="32"/>
-          <w:szCs w:val="32"/>
-          <w:lang w:val="en-US"/>
-          <w14:ligatures w14:val="none"/>
+          <w:caps w:val="0"/>
+          <w:sz w:val="20"/>
+          <w:szCs w:val="20"/>
+        </w:rPr>
+        <w:t xml:space="preserve">Jl. Sudirman KM. 03, Kembanglimus, Borobudur Kode </w:t>
+      </w:r>
+      <w:proofErr w:type="gramStart"/>
+      <w:r>
+        <w:rPr>
+          <w:caps w:val="0"/>
+          <w:sz w:val="20"/>
+          <w:szCs w:val="20"/>
+        </w:rPr>
+        <w:t>Pos :</w:t>
+      </w:r>
+      <w:proofErr w:type="gramEnd"/>
+      <w:r>
+        <w:rPr>
+          <w:caps w:val="0"/>
+          <w:sz w:val="20"/>
+          <w:szCs w:val="20"/>
+        </w:rPr>
+        <w:t xml:space="preserve"> 56553</w:t>
+      </w:r>
+    </w:p>
+    <w:p>
+      <w:pPr>
+        <w:pStyle w:val="HeaderSurat"/>
+        <w:pBdr>
+          <w:bottom w:val="thinThickThinMediumGap" w:sz="18" w:space="1" w:color="auto"/>
+        </w:pBdr>
+        <w:ind w:left="0"/>
+        <w:rPr>
+          <w:caps w:val="0"/>
+          <w:sz w:val="20"/>
+          <w:szCs w:val="20"/>
+        </w:rPr>
+      </w:pPr>
+      <w:proofErr w:type="gramStart"/>
+      <w:r>
+        <w:rPr>
+          <w:caps w:val="0"/>
+          <w:sz w:val="20"/>
+          <w:szCs w:val="20"/>
+        </w:rPr>
+        <w:t>Telp :</w:t>
+      </w:r>
+      <w:proofErr w:type="gramEnd"/>
+      <w:r>
+        <w:rPr>
+          <w:caps w:val="0"/>
+          <w:sz w:val="20"/>
+          <w:szCs w:val="20"/>
+        </w:rPr>
+        <w:t xml:space="preserve"> (0293) 7182286 </w:t>
+      </w:r>
+      <w:proofErr w:type="gramStart"/>
+      <w:r>
+        <w:rPr>
+          <w:caps w:val="0"/>
+          <w:sz w:val="20"/>
+          <w:szCs w:val="20"/>
+        </w:rPr>
+        <w:t>E-Mail :</w:t>
+      </w:r>
+      <w:proofErr w:type="gramEnd"/>
+      <w:r>
+        <w:rPr>
+          <w:caps w:val="0"/>
+          <w:sz w:val="20"/>
+          <w:szCs w:val="20"/>
         </w:rPr>
         <w:t xml:space="preserve"> </w:t>
       </w:r>
+      <w:hyperlink r:id="rId6" w:history="1">
+        <w:r>
+          <w:rPr>
+            <w:rStyle w:val="Hyperlink"/>
+            <w:rFonts w:eastAsiaTheme="majorEastAsia"/>
+            <w:caps w:val="0"/>
+            <w:sz w:val="20"/>
+            <w:szCs w:val="20"/>
+          </w:rPr>
+          <w:t>desakembanglimus1@gmail.com</w:t>
+        </w:r>
+      </w:hyperlink>
       <w:r>
         <w:rPr>
-          <w:rFonts w:ascii="Bookman Old Style" w:eastAsia="Times New Roman" w:hAnsi="Bookman Old Style" w:cs="Times New Roman"/>
-          <w:noProof/>
-          <w:kern w:val="0"/>
-          <w:sz w:val="32"/>
-          <w:szCs w:val="32"/>
-          <w:lang w:val="en-US"/>
-          <w14:ligatures w14:val="none"/>
-        </w:rPr>
-        <w:t>{</w:t>
-      </w:r>
-      <w:r>
-        <w:rPr>
-          <w:rFonts w:ascii="Bookman Old Style" w:eastAsia="Times New Roman" w:hAnsi="Bookman Old Style" w:cs="Times New Roman"/>
-          <w:noProof/>
-          <w:kern w:val="0"/>
-          <w:sz w:val="32"/>
-          <w:szCs w:val="32"/>
-          <w:lang w:val="en-US"/>
-          <w14:ligatures w14:val="none"/>
-        </w:rPr>
-        <w:t>nama_kabupaten</w:t>
-      </w:r>
-      <w:r>
-        <w:rPr>
-          <w:rFonts w:ascii="Bookman Old Style" w:eastAsia="Times New Roman" w:hAnsi="Bookman Old Style" w:cs="Times New Roman"/>
-          <w:noProof/>
-          <w:kern w:val="0"/>
-          <w:sz w:val="32"/>
-          <w:szCs w:val="32"/>
-          <w:lang w:val="en-US"/>
-          <w14:ligatures w14:val="none"/>
-        </w:rPr>
-        <w:t>}</w:t>
-      </w:r>
-    </w:p>
-    <w:p>
-      <w:pPr>
-        <w:suppressAutoHyphens/>
-        <w:autoSpaceDN w:val="0"/>
-        <w:spacing w:after="0" w:line="240" w:lineRule="auto"/>
-        <w:ind w:left="1560"/>
-        <w:jc w:val="center"/>
-        <w:rPr>
-          <w:rFonts w:ascii="Bookman Old Style" w:eastAsia="Times New Roman" w:hAnsi="Bookman Old Style" w:cs="Times New Roman"/>
-          <w:caps/>
-          <w:kern w:val="0"/>
-          <w:sz w:val="36"/>
-          <w:szCs w:val="36"/>
-          <w:lang w:val="en-US"/>
-          <w14:ligatures w14:val="none"/>
-        </w:rPr>
-      </w:pPr>
-      <w:r>
-        <w:rPr>
-          <w:rFonts w:ascii="Bookman Old Style" w:eastAsia="Times New Roman" w:hAnsi="Bookman Old Style" w:cs="Times New Roman"/>
-          <w:kern w:val="0"/>
-          <w:sz w:val="32"/>
-          <w:szCs w:val="32"/>
-          <w:lang w:val="en-US"/>
-          <w14:ligatures w14:val="none"/>
-        </w:rPr>
-        <w:t>KECAMATAN</w:t>
-      </w:r>
-      <w:r>
-        <w:rPr>
-          <w:rFonts w:ascii="Bookman Old Style" w:eastAsia="Times New Roman" w:hAnsi="Bookman Old Style" w:cs="Times New Roman"/>
-          <w:kern w:val="0"/>
-          <w:sz w:val="32"/>
-          <w:szCs w:val="32"/>
-          <w:lang w:val="en-US"/>
-          <w14:ligatures w14:val="none"/>
+          <w:caps w:val="0"/>
+          <w:sz w:val="20"/>
+          <w:szCs w:val="20"/>
         </w:rPr>
         <w:t xml:space="preserve"> </w:t>
       </w:r>
-      <w:r>
-        <w:rPr>
-          <w:rFonts w:ascii="Bookman Old Style" w:eastAsia="Times New Roman" w:hAnsi="Bookman Old Style" w:cs="Times New Roman"/>
-          <w:kern w:val="0"/>
-          <w:sz w:val="32"/>
-          <w:szCs w:val="32"/>
-          <w:lang w:val="en-US"/>
-          <w14:ligatures w14:val="none"/>
-        </w:rPr>
-        <w:t>{</w:t>
-      </w:r>
-      <w:r>
-        <w:rPr>
-          <w:rFonts w:ascii="Bookman Old Style" w:eastAsia="Times New Roman" w:hAnsi="Bookman Old Style" w:cs="Times New Roman"/>
-          <w:kern w:val="0"/>
-          <w:sz w:val="32"/>
-          <w:szCs w:val="32"/>
-          <w:lang w:val="en-US"/>
-          <w14:ligatures w14:val="none"/>
-        </w:rPr>
-        <w:t>nama_kecamatan</w:t>
-      </w:r>
-      <w:r>
-        <w:rPr>
-          <w:rFonts w:ascii="Bookman Old Style" w:eastAsia="Times New Roman" w:hAnsi="Bookman Old Style" w:cs="Times New Roman"/>
-          <w:kern w:val="0"/>
-          <w:sz w:val="36"/>
-          <w:szCs w:val="36"/>
-          <w:lang w:val="en-US"/>
-          <w14:ligatures w14:val="none"/>
-        </w:rPr>
-        <w:t>}</w:t>
-      </w:r>
-    </w:p>
-    <w:p>
-      <w:pPr>
-        <w:suppressAutoHyphens/>
-        <w:autoSpaceDN w:val="0"/>
-        <w:spacing w:after="0" w:line="240" w:lineRule="auto"/>
-        <w:ind w:left="1560"/>
-        <w:jc w:val="center"/>
-        <w:rPr>
-          <w:rFonts w:ascii="Bookman Old Style" w:eastAsia="Times New Roman" w:hAnsi="Bookman Old Style" w:cs="Times New Roman"/>
-          <w:b/>
-          <w:bCs/>
-          <w:caps/>
-          <w:kern w:val="0"/>
-          <w:sz w:val="36"/>
-          <w:szCs w:val="36"/>
-          <w:lang w:val="en-US"/>
-          <w14:ligatures w14:val="none"/>
-        </w:rPr>
-      </w:pPr>
-      <w:r>
-        <w:rPr>
-          <w:rFonts w:ascii="Bookman Old Style" w:eastAsia="Times New Roman" w:hAnsi="Bookman Old Style" w:cs="Times New Roman"/>
-          <w:b/>
-          <w:bCs/>
-          <w:kern w:val="0"/>
-          <w:sz w:val="36"/>
-          <w:szCs w:val="36"/>
-          <w:lang w:val="en-US"/>
-          <w14:ligatures w14:val="none"/>
-        </w:rPr>
-        <w:t xml:space="preserve">DESA </w:t>
-      </w:r>
-      <w:r>
-        <w:rPr>
-          <w:rFonts w:ascii="Bookman Old Style" w:eastAsia="Times New Roman" w:hAnsi="Bookman Old Style" w:cs="Times New Roman"/>
-          <w:b/>
-          <w:bCs/>
-          <w:kern w:val="0"/>
-          <w:sz w:val="36"/>
-          <w:szCs w:val="36"/>
-          <w:lang w:val="en-US"/>
-          <w14:ligatures w14:val="none"/>
-        </w:rPr>
-        <w:t>{</w:t>
-      </w:r>
-      <w:r>
-        <w:rPr>
-          <w:rFonts w:ascii="Bookman Old Style" w:eastAsia="Times New Roman" w:hAnsi="Bookman Old Style" w:cs="Times New Roman"/>
-          <w:b/>
-          <w:bCs/>
-          <w:kern w:val="0"/>
-          <w:sz w:val="36"/>
-          <w:szCs w:val="36"/>
-          <w:lang w:val="en-US"/>
-          <w14:ligatures w14:val="none"/>
-        </w:rPr>
-        <w:t>nama_desa</w:t>
-      </w:r>
-      <w:r>
-        <w:rPr>
-          <w:rFonts w:ascii="Bookman Old Style" w:eastAsia="Times New Roman" w:hAnsi="Bookman Old Style" w:cs="Times New Roman"/>
-          <w:b/>
-          <w:bCs/>
-          <w:kern w:val="0"/>
-          <w:sz w:val="36"/>
-          <w:szCs w:val="36"/>
-          <w:lang w:val="en-US"/>
-          <w14:ligatures w14:val="none"/>
-        </w:rPr>
-        <w:t>}</w:t>
-      </w:r>
-    </w:p>
-    <w:p>
-      <w:pPr>
-        <w:suppressAutoHyphens/>
-        <w:autoSpaceDN w:val="0"/>
-        <w:spacing w:after="0" w:line="240" w:lineRule="auto"/>
-        <w:ind w:left="1560"/>
-        <w:jc w:val="center"/>
-        <w:rPr>
-          <w:rFonts w:ascii="Bookman Old Style" w:eastAsia="Times New Roman" w:hAnsi="Bookman Old Style" w:cs="Times New Roman"/>
-          <w:kern w:val="0"/>
-          <w:sz w:val="20"/>
-          <w:szCs w:val="20"/>
-          <w:lang w:val="en-US"/>
-          <w14:ligatures w14:val="none"/>
-        </w:rPr>
-      </w:pPr>
-      <w:r>
-        <w:rPr>
-          <w:rFonts w:ascii="Bookman Old Style" w:eastAsia="Times New Roman" w:hAnsi="Bookman Old Style" w:cs="Times New Roman"/>
-          <w:kern w:val="0"/>
-          <w:sz w:val="20"/>
-          <w:szCs w:val="20"/>
-          <w:lang w:val="en-US"/>
-          <w14:ligatures w14:val="none"/>
-        </w:rPr>
-        <w:t>{</w:t>
-      </w:r>
-      <w:r>
-        <w:rPr>
-          <w:rFonts w:ascii="Bookman Old Style" w:eastAsia="Times New Roman" w:hAnsi="Bookman Old Style" w:cs="Times New Roman"/>
-          <w:kern w:val="0"/>
-          <w:sz w:val="20"/>
-          <w:szCs w:val="20"/>
-          <w:lang w:val="en-US"/>
-          <w14:ligatures w14:val="none"/>
-        </w:rPr>
-        <w:t>alamat_desa</w:t>
-      </w:r>
-      <w:r>
-        <w:rPr>
-          <w:rFonts w:ascii="Bookman Old Style" w:eastAsia="Times New Roman" w:hAnsi="Bookman Old Style" w:cs="Times New Roman"/>
-          <w:kern w:val="0"/>
-          <w:sz w:val="20"/>
-          <w:szCs w:val="20"/>
-          <w:lang w:val="en-US"/>
-          <w14:ligatures w14:val="none"/>
-        </w:rPr>
-        <w:t>}</w:t>
-      </w:r>
-      <w:r>
-        <w:rPr>
-          <w:rFonts w:ascii="Bookman Old Style" w:eastAsia="Times New Roman" w:hAnsi="Bookman Old Style" w:cs="Times New Roman"/>
-          <w:kern w:val="0"/>
-          <w:sz w:val="20"/>
-          <w:szCs w:val="20"/>
-          <w:lang w:val="en-US"/>
-          <w14:ligatures w14:val="none"/>
-        </w:rPr>
-        <w:t>,</w:t>
-      </w:r>
-      <w:r>
-        <w:rPr>
-          <w:rFonts w:ascii="Bookman Old Style" w:eastAsia="Times New Roman" w:hAnsi="Bookman Old Style" w:cs="Times New Roman"/>
-          <w:kern w:val="0"/>
-          <w:sz w:val="20"/>
-          <w:szCs w:val="20"/>
-          <w:lang w:val="en-US"/>
-          <w14:ligatures w14:val="none"/>
-        </w:rPr>
-        <w:t xml:space="preserve"> </w:t>
-      </w:r>
-      <w:r>
-        <w:rPr>
-          <w:rFonts w:ascii="Bookman Old Style" w:eastAsia="Times New Roman" w:hAnsi="Bookman Old Style" w:cs="Times New Roman"/>
-          <w:kern w:val="0"/>
-          <w:sz w:val="20"/>
-          <w:szCs w:val="20"/>
-          <w:lang w:val="en-US"/>
-          <w14:ligatures w14:val="none"/>
-        </w:rPr>
-        <w:t xml:space="preserve">Kode Pos : </w:t>
-      </w:r>
-      <w:r>
-        <w:rPr>
-          <w:rFonts w:ascii="Bookman Old Style" w:eastAsia="Times New Roman" w:hAnsi="Bookman Old Style" w:cs="Times New Roman"/>
-          <w:kern w:val="0"/>
-          <w:sz w:val="20"/>
-          <w:szCs w:val="20"/>
-          <w:lang w:val="en-US"/>
-          <w14:ligatures w14:val="none"/>
-        </w:rPr>
-        <w:t>{</w:t>
-      </w:r>
-      <w:r>
-        <w:rPr>
-          <w:rFonts w:ascii="Bookman Old Style" w:eastAsia="Times New Roman" w:hAnsi="Bookman Old Style" w:cs="Times New Roman"/>
-          <w:kern w:val="0"/>
-          <w:sz w:val="20"/>
-          <w:szCs w:val="20"/>
-          <w:lang w:val="en-US"/>
-          <w14:ligatures w14:val="none"/>
-        </w:rPr>
-        <w:t>kode_pos_desa</w:t>
-      </w:r>
-      <w:r>
-        <w:rPr>
-          <w:rFonts w:ascii="Bookman Old Style" w:eastAsia="Times New Roman" w:hAnsi="Bookman Old Style" w:cs="Times New Roman"/>
-          <w:kern w:val="0"/>
-          <w:sz w:val="20"/>
-          <w:szCs w:val="20"/>
-          <w:lang w:val="en-US"/>
-          <w14:ligatures w14:val="none"/>
-        </w:rPr>
-        <w:t>}</w:t>
-      </w:r>
-    </w:p>
-    <w:p>
-      <w:pPr>
-        <w:suppressAutoHyphens/>
-        <w:autoSpaceDN w:val="0"/>
-        <w:spacing w:after="0" w:line="240" w:lineRule="auto"/>
-        <w:ind w:left="1560"/>
-        <w:jc w:val="center"/>
-        <w:rPr>
-          <w:rFonts w:ascii="Bookman Old Style" w:eastAsia="Times New Roman" w:hAnsi="Bookman Old Style" w:cs="Times New Roman"/>
-          <w:kern w:val="0"/>
-          <w:sz w:val="20"/>
-          <w:szCs w:val="20"/>
-          <w:lang w:val="en-US"/>
-          <w14:ligatures w14:val="none"/>
-        </w:rPr>
-      </w:pPr>
-      <w:r>
-        <w:rPr>
-          <w:rFonts w:ascii="Bookman Old Style" w:eastAsia="Times New Roman" w:hAnsi="Bookman Old Style" w:cs="Times New Roman"/>
-          <w:kern w:val="0"/>
-          <w:sz w:val="20"/>
-          <w:szCs w:val="20"/>
-          <w:lang w:val="en-US"/>
-          <w14:ligatures w14:val="none"/>
-        </w:rPr>
-        <w:t xml:space="preserve">Telp : </w:t>
-      </w:r>
-      <w:r>
-        <w:rPr>
-          <w:rFonts w:ascii="Bookman Old Style" w:eastAsia="Times New Roman" w:hAnsi="Bookman Old Style" w:cs="Times New Roman"/>
-          <w:kern w:val="0"/>
-          <w:sz w:val="20"/>
-          <w:szCs w:val="20"/>
-          <w:lang w:val="en-US"/>
-          <w14:ligatures w14:val="none"/>
-        </w:rPr>
-        <w:t>{</w:t>
-      </w:r>
-      <w:r>
-        <w:rPr>
-          <w:rFonts w:ascii="Bookman Old Style" w:eastAsia="Times New Roman" w:hAnsi="Bookman Old Style" w:cs="Times New Roman"/>
-          <w:kern w:val="0"/>
-          <w:sz w:val="20"/>
-          <w:szCs w:val="20"/>
-          <w:lang w:val="en-US"/>
-          <w14:ligatures w14:val="none"/>
-        </w:rPr>
-        <w:t>telp_desa</w:t>
-      </w:r>
-      <w:r>
-        <w:rPr>
-          <w:rFonts w:ascii="Bookman Old Style" w:eastAsia="Times New Roman" w:hAnsi="Bookman Old Style" w:cs="Times New Roman"/>
-          <w:kern w:val="0"/>
-          <w:sz w:val="20"/>
-          <w:szCs w:val="20"/>
-          <w:lang w:val="en-US"/>
-          <w14:ligatures w14:val="none"/>
-        </w:rPr>
-        <w:t>}</w:t>
-      </w:r>
-      <w:r>
-        <w:rPr>
-          <w:rFonts w:ascii="Bookman Old Style" w:eastAsia="Times New Roman" w:hAnsi="Bookman Old Style" w:cs="Times New Roman"/>
-          <w:kern w:val="0"/>
-          <w:sz w:val="20"/>
-          <w:szCs w:val="20"/>
-          <w:lang w:val="en-US"/>
-          <w14:ligatures w14:val="none"/>
-        </w:rPr>
-        <w:t xml:space="preserve"> </w:t>
-      </w:r>
-      <w:r>
-        <w:rPr>
-          <w:rFonts w:ascii="Bookman Old Style" w:eastAsia="Times New Roman" w:hAnsi="Bookman Old Style" w:cs="Times New Roman"/>
-          <w:kern w:val="0"/>
-          <w:sz w:val="20"/>
-          <w:szCs w:val="20"/>
-          <w:lang w:val="en-US"/>
-          <w14:ligatures w14:val="none"/>
-        </w:rPr>
-        <w:t xml:space="preserve">E-Mail : </w:t>
-      </w:r>
-      <w:r>
-        <w:rPr>
-          <w:rFonts w:ascii="Bookman Old Style" w:eastAsia="Times New Roman" w:hAnsi="Bookman Old Style" w:cs="Times New Roman"/>
-          <w:kern w:val="0"/>
-          <w:sz w:val="20"/>
-          <w:szCs w:val="20"/>
-          <w:lang w:val="en-US"/>
-          <w14:ligatures w14:val="none"/>
-        </w:rPr>
-        <w:t>{</w:t>
-      </w:r>
-      <w:r>
-        <w:rPr>
-          <w:rFonts w:ascii="Bookman Old Style" w:eastAsia="Times New Roman" w:hAnsi="Bookman Old Style" w:cs="Times New Roman"/>
-          <w:kern w:val="0"/>
-          <w:sz w:val="20"/>
-          <w:szCs w:val="20"/>
-          <w:lang w:val="en-US"/>
-          <w14:ligatures w14:val="none"/>
-        </w:rPr>
-        <w:t>email_desa</w:t>
-      </w:r>
-      <w:r>
-        <w:rPr>
-          <w:rFonts w:ascii="Bookman Old Style" w:eastAsia="Times New Roman" w:hAnsi="Bookman Old Style" w:cs="Times New Roman"/>
-          <w:kern w:val="0"/>
-          <w:sz w:val="20"/>
-          <w:szCs w:val="20"/>
-          <w:lang w:val="en-US"/>
-          <w14:ligatures w14:val="none"/>
-        </w:rPr>
-        <w:t>}</w:t>
-      </w:r>
-    </w:p>
-    <w:p>
-      <w:pPr>
-        <w:pBdr>
-          <w:bottom w:val="single" w:sz="36" w:space="1" w:color="auto"/>
-        </w:pBdr>
-        <w:suppressAutoHyphens/>
-        <w:autoSpaceDN w:val="0"/>
-        <w:spacing w:after="0" w:line="120" w:lineRule="auto"/>
-        <w:jc w:val="center"/>
-        <w:rPr>
-          <w:rFonts w:ascii="Bookman Old Style" w:eastAsia="Times New Roman" w:hAnsi="Bookman Old Style" w:cs="Times New Roman"/>
-          <w:kern w:val="0"/>
-          <w:sz w:val="20"/>
-          <w:lang w:val="en-US"/>
-          <w14:ligatures w14:val="none"/>
-        </w:rPr>
-      </w:pPr>
     </w:p>
     <w:p>
       <w:pPr>
@@ -568,7 +223,6 @@
         <w:suppressAutoHyphens/>
         <w:autoSpaceDN w:val="0"/>
         <w:spacing w:after="0" w:line="240" w:lineRule="auto"/>
-        <w:jc w:val="center"/>
         <w:outlineLvl w:val="2"/>
         <w:rPr>
           <w:rFonts w:ascii="Bookman Old Style" w:eastAsia="Times New Roman" w:hAnsi="Bookman Old Style" w:cs="Times New Roman"/>
@@ -5674,46 +5328,30 @@
     </w:p>
     <w:p>
       <w:pPr>
-        <w:suppressAutoHyphens/>
-        <w:autoSpaceDN w:val="0"/>
-        <w:spacing w:after="0" w:line="240" w:lineRule="auto"/>
-        <w:jc w:val="center"/>
+        <w:pStyle w:val="HeaderSurat"/>
+        <w:ind w:left="0"/>
         <w:rPr>
-          <w:rFonts w:ascii="Bookman Old Style" w:eastAsia="Times New Roman" w:hAnsi="Bookman Old Style" w:cs="Times New Roman"/>
-          <w:caps/>
           <w:noProof/>
-          <w:kern w:val="0"/>
-          <w:sz w:val="32"/>
-          <w:szCs w:val="32"/>
-          <w:lang w:val="en-US"/>
-          <w14:ligatures w14:val="none"/>
         </w:rPr>
       </w:pPr>
       <w:r>
         <w:rPr>
-          <w:rFonts w:ascii="Bookman Old Style" w:eastAsia="Times New Roman" w:hAnsi="Bookman Old Style" w:cs="Times New Roman"/>
-          <w:caps/>
           <w:noProof/>
-          <w:kern w:val="0"/>
-          <w:sz w:val="36"/>
-          <w:szCs w:val="36"/>
-          <w:lang w:val="en-US"/>
-          <w14:ligatures w14:val="none"/>
         </w:rPr>
         <w:lastRenderedPageBreak/>
         <w:drawing>
-          <wp:anchor distT="0" distB="0" distL="114300" distR="114300" simplePos="0" relativeHeight="251660288" behindDoc="1" locked="0" layoutInCell="1" allowOverlap="1" wp14:anchorId="00A5AFF6" wp14:editId="6F5C25CA">
+          <wp:anchor distT="0" distB="0" distL="114300" distR="114300" simplePos="0" relativeHeight="251665408" behindDoc="1" locked="0" layoutInCell="1" allowOverlap="1" wp14:anchorId="3D9C92AA" wp14:editId="3AB36517">
             <wp:simplePos x="0" y="0"/>
             <wp:positionH relativeFrom="column">
-              <wp:posOffset>-257176</wp:posOffset>
+              <wp:posOffset>-327804</wp:posOffset>
             </wp:positionH>
             <wp:positionV relativeFrom="paragraph">
-              <wp:posOffset>13334</wp:posOffset>
+              <wp:posOffset>0</wp:posOffset>
             </wp:positionV>
-            <wp:extent cx="1076325" cy="1076325"/>
+            <wp:extent cx="975360" cy="975360"/>
             <wp:effectExtent l="0" t="0" r="0" b="0"/>
             <wp:wrapNone/>
-            <wp:docPr id="364871096" name="Picture 1"/>
+            <wp:docPr id="1883433626" name="Picture 1883433626" descr="A green shield with a red and yellow logo&#10;&#10;AI-generated content may be incorrect."/>
             <wp:cNvGraphicFramePr>
               <a:graphicFrameLocks xmlns:a="http://schemas.openxmlformats.org/drawingml/2006/main" noChangeAspect="1"/>
             </wp:cNvGraphicFramePr>
@@ -5721,7 +5359,7 @@
               <a:graphicData uri="http://schemas.openxmlformats.org/drawingml/2006/picture">
                 <pic:pic xmlns:pic="http://schemas.openxmlformats.org/drawingml/2006/picture">
                   <pic:nvPicPr>
-                    <pic:cNvPr id="0" name="Picture 1"/>
+                    <pic:cNvPr id="1" name="Picture 1" descr="A green shield with a red and yellow logo&#10;&#10;AI-generated content may be incorrect."/>
                     <pic:cNvPicPr>
                       <a:picLocks noChangeAspect="1" noChangeArrowheads="1"/>
                     </pic:cNvPicPr>
@@ -5742,12 +5380,15 @@
                   <pic:spPr bwMode="auto">
                     <a:xfrm>
                       <a:off x="0" y="0"/>
-                      <a:ext cx="1076325" cy="1076325"/>
+                      <a:ext cx="975360" cy="975360"/>
                     </a:xfrm>
                     <a:prstGeom prst="rect">
                       <a:avLst/>
                     </a:prstGeom>
                     <a:noFill/>
+                    <a:ln>
+                      <a:noFill/>
+                    </a:ln>
                   </pic:spPr>
                 </pic:pic>
               </a:graphicData>
@@ -5763,478 +5404,152 @@
       </w:r>
       <w:r>
         <w:rPr>
-          <w:rFonts w:ascii="Bookman Old Style" w:eastAsia="Times New Roman" w:hAnsi="Bookman Old Style" w:cs="Times New Roman"/>
-          <w:caps/>
           <w:noProof/>
-          <w:kern w:val="0"/>
-          <w:sz w:val="36"/>
-          <w:szCs w:val="36"/>
-          <w:lang w:val="en-US"/>
-          <w14:ligatures w14:val="none"/>
+        </w:rPr>
+        <w:t>PEMERINTAH KABUPATEN Magelang</w:t>
+      </w:r>
+    </w:p>
+    <w:p>
+      <w:pPr>
+        <w:pStyle w:val="HeaderSurat"/>
+        <w:ind w:left="0"/>
+      </w:pPr>
+      <w:r>
+        <w:t>KECAMATAN Borobudur</w:t>
+      </w:r>
+    </w:p>
+    <w:p>
+      <w:pPr>
+        <w:pStyle w:val="HeaderSurat"/>
+        <w:ind w:left="0"/>
+        <w:rPr>
+          <w:b/>
+          <w:bCs/>
+        </w:rPr>
+      </w:pPr>
+      <w:r>
+        <w:rPr>
+          <w:b/>
+          <w:bCs/>
+        </w:rPr>
+        <w:t>desa Kembanglimus</w:t>
+      </w:r>
+    </w:p>
+    <w:p>
+      <w:pPr>
+        <w:pStyle w:val="HeaderSurat"/>
+        <w:ind w:left="0"/>
+        <w:rPr>
+          <w:caps w:val="0"/>
+          <w:sz w:val="20"/>
+          <w:szCs w:val="20"/>
+        </w:rPr>
+      </w:pPr>
+      <w:r>
+        <w:rPr>
+          <w:caps w:val="0"/>
+          <w:sz w:val="20"/>
+          <w:szCs w:val="20"/>
+        </w:rPr>
+        <w:t xml:space="preserve">Jl. Sudirman KM. 03, Kembanglimus, Borobudur Kode </w:t>
+      </w:r>
+      <w:proofErr w:type="gramStart"/>
+      <w:r>
+        <w:rPr>
+          <w:caps w:val="0"/>
+          <w:sz w:val="20"/>
+          <w:szCs w:val="20"/>
+        </w:rPr>
+        <w:t>Pos :</w:t>
+      </w:r>
+      <w:proofErr w:type="gramEnd"/>
+      <w:r>
+        <w:rPr>
+          <w:caps w:val="0"/>
+          <w:sz w:val="20"/>
+          <w:szCs w:val="20"/>
+        </w:rPr>
+        <w:t xml:space="preserve"> 56553</w:t>
+      </w:r>
+    </w:p>
+    <w:p>
+      <w:pPr>
+        <w:pStyle w:val="HeaderSurat"/>
+        <w:pBdr>
+          <w:bottom w:val="thinThickThinMediumGap" w:sz="18" w:space="1" w:color="auto"/>
+        </w:pBdr>
+        <w:ind w:left="0"/>
+        <w:rPr>
+          <w:caps w:val="0"/>
+          <w:sz w:val="20"/>
+          <w:szCs w:val="20"/>
+        </w:rPr>
+      </w:pPr>
+      <w:proofErr w:type="gramStart"/>
+      <w:r>
+        <w:rPr>
+          <w:caps w:val="0"/>
+          <w:sz w:val="20"/>
+          <w:szCs w:val="20"/>
+        </w:rPr>
+        <w:t>Telp :</w:t>
+      </w:r>
+      <w:proofErr w:type="gramEnd"/>
+      <w:r>
+        <w:rPr>
+          <w:caps w:val="0"/>
+          <w:sz w:val="20"/>
+          <w:szCs w:val="20"/>
+        </w:rPr>
+        <w:t xml:space="preserve"> (0293) 7182286 </w:t>
+      </w:r>
+      <w:proofErr w:type="gramStart"/>
+      <w:r>
+        <w:rPr>
+          <w:caps w:val="0"/>
+          <w:sz w:val="20"/>
+          <w:szCs w:val="20"/>
+        </w:rPr>
+        <w:t>E-Mail :</w:t>
+      </w:r>
+      <w:proofErr w:type="gramEnd"/>
+      <w:r>
+        <w:rPr>
+          <w:caps w:val="0"/>
+          <w:sz w:val="20"/>
+          <w:szCs w:val="20"/>
         </w:rPr>
         <w:t xml:space="preserve"> </w:t>
       </w:r>
+      <w:hyperlink r:id="rId7" w:history="1">
+        <w:r>
+          <w:rPr>
+            <w:rStyle w:val="Hyperlink"/>
+            <w:rFonts w:eastAsiaTheme="majorEastAsia"/>
+            <w:caps w:val="0"/>
+            <w:sz w:val="20"/>
+            <w:szCs w:val="20"/>
+          </w:rPr>
+          <w:t>desakembanglimus1@gmail.com</w:t>
+        </w:r>
+      </w:hyperlink>
       <w:r>
         <w:rPr>
-          <w:rFonts w:ascii="Bookman Old Style" w:eastAsia="Times New Roman" w:hAnsi="Bookman Old Style" w:cs="Times New Roman"/>
-          <w:caps/>
-          <w:noProof/>
-          <w:kern w:val="0"/>
-          <w:sz w:val="32"/>
-          <w:szCs w:val="32"/>
-          <w:lang w:val="en-US"/>
-          <w14:ligatures w14:val="none"/>
+          <w:caps w:val="0"/>
+          <w:sz w:val="20"/>
+          <w:szCs w:val="20"/>
         </w:rPr>
-        <w:t xml:space="preserve">PEMERINTAH </w:t>
-      </w:r>
-      <w:r>
-        <w:rPr>
-          <w:rFonts w:ascii="Bookman Old Style" w:eastAsia="Times New Roman" w:hAnsi="Bookman Old Style" w:cs="Times New Roman"/>
-          <w:caps/>
-          <w:noProof/>
-          <w:kern w:val="0"/>
-          <w:sz w:val="32"/>
-          <w:szCs w:val="32"/>
-          <w:lang w:val="en-US"/>
-          <w14:ligatures w14:val="none"/>
-        </w:rPr>
-        <w:t xml:space="preserve">KABUPATEN </w:t>
-      </w:r>
-      <w:r>
-        <w:rPr>
-          <w:rFonts w:ascii="Bookman Old Style" w:eastAsia="Times New Roman" w:hAnsi="Bookman Old Style" w:cs="Times New Roman"/>
-          <w:noProof/>
-          <w:kern w:val="0"/>
-          <w:sz w:val="32"/>
-          <w:szCs w:val="32"/>
-          <w:lang w:val="en-US"/>
-          <w14:ligatures w14:val="none"/>
-        </w:rPr>
-        <w:t>{</w:t>
-      </w:r>
-      <w:r>
-        <w:rPr>
-          <w:rFonts w:ascii="Bookman Old Style" w:eastAsia="Times New Roman" w:hAnsi="Bookman Old Style" w:cs="Times New Roman"/>
-          <w:noProof/>
-          <w:kern w:val="0"/>
-          <w:sz w:val="32"/>
-          <w:szCs w:val="32"/>
-          <w:lang w:val="en-US"/>
-          <w14:ligatures w14:val="none"/>
-        </w:rPr>
-        <w:t>nama_kabupaten</w:t>
-      </w:r>
-      <w:r>
-        <w:rPr>
-          <w:rFonts w:ascii="Bookman Old Style" w:eastAsia="Times New Roman" w:hAnsi="Bookman Old Style" w:cs="Times New Roman"/>
-          <w:noProof/>
-          <w:kern w:val="0"/>
-          <w:sz w:val="32"/>
-          <w:szCs w:val="32"/>
-          <w:lang w:val="en-US"/>
-          <w14:ligatures w14:val="none"/>
-        </w:rPr>
-        <w:t>}</w:t>
+        <w:t xml:space="preserve"> </w:t>
       </w:r>
     </w:p>
     <w:p>
       <w:pPr>
-        <w:suppressAutoHyphens/>
-        <w:autoSpaceDN w:val="0"/>
-        <w:spacing w:after="0" w:line="240" w:lineRule="auto"/>
-        <w:jc w:val="center"/>
+        <w:pStyle w:val="HeaderSurat"/>
+        <w:ind w:left="0"/>
         <w:rPr>
-          <w:rFonts w:ascii="Bookman Old Style" w:eastAsia="Times New Roman" w:hAnsi="Bookman Old Style" w:cs="Times New Roman"/>
-          <w:caps/>
-          <w:kern w:val="0"/>
-          <w:sz w:val="36"/>
-          <w:szCs w:val="36"/>
-          <w:lang w:val="en-US"/>
-          <w14:ligatures w14:val="none"/>
-        </w:rPr>
-      </w:pPr>
-      <w:r>
-        <w:rPr>
-          <w:rFonts w:ascii="Bookman Old Style" w:eastAsia="Times New Roman" w:hAnsi="Bookman Old Style" w:cs="Times New Roman"/>
-          <w:kern w:val="0"/>
-          <w:sz w:val="32"/>
-          <w:szCs w:val="32"/>
-          <w:lang w:val="en-US"/>
-          <w14:ligatures w14:val="none"/>
-        </w:rPr>
-        <w:t xml:space="preserve">KECAMATAN </w:t>
-      </w:r>
-      <w:r>
-        <w:rPr>
-          <w:rFonts w:ascii="Bookman Old Style" w:eastAsia="Times New Roman" w:hAnsi="Bookman Old Style" w:cs="Times New Roman"/>
-          <w:kern w:val="0"/>
-          <w:sz w:val="32"/>
-          <w:szCs w:val="32"/>
-          <w:lang w:val="en-US"/>
-          <w14:ligatures w14:val="none"/>
-        </w:rPr>
-        <w:t>{</w:t>
-      </w:r>
-      <w:r>
-        <w:rPr>
-          <w:rFonts w:ascii="Bookman Old Style" w:eastAsia="Times New Roman" w:hAnsi="Bookman Old Style" w:cs="Times New Roman"/>
-          <w:kern w:val="0"/>
-          <w:sz w:val="32"/>
-          <w:szCs w:val="32"/>
-          <w:lang w:val="en-US"/>
-          <w14:ligatures w14:val="none"/>
-        </w:rPr>
-        <w:t>nama_kecamatan</w:t>
-      </w:r>
-      <w:r>
-        <w:rPr>
-          <w:rFonts w:ascii="Bookman Old Style" w:eastAsia="Times New Roman" w:hAnsi="Bookman Old Style" w:cs="Times New Roman"/>
-          <w:kern w:val="0"/>
-          <w:sz w:val="32"/>
-          <w:szCs w:val="32"/>
-          <w:lang w:val="en-US"/>
-          <w14:ligatures w14:val="none"/>
-        </w:rPr>
-        <w:t>}</w:t>
-      </w:r>
-    </w:p>
-    <w:p>
-      <w:pPr>
-        <w:suppressAutoHyphens/>
-        <w:autoSpaceDN w:val="0"/>
-        <w:spacing w:after="0" w:line="240" w:lineRule="auto"/>
-        <w:jc w:val="center"/>
-        <w:rPr>
-          <w:rFonts w:ascii="Bookman Old Style" w:eastAsia="Times New Roman" w:hAnsi="Bookman Old Style" w:cs="Times New Roman"/>
-          <w:b/>
-          <w:bCs/>
-          <w:caps/>
-          <w:kern w:val="0"/>
-          <w:sz w:val="36"/>
-          <w:szCs w:val="36"/>
-          <w:lang w:val="en-US"/>
-          <w14:ligatures w14:val="none"/>
-        </w:rPr>
-      </w:pPr>
-      <w:r>
-        <w:rPr>
-          <w:rFonts w:ascii="Bookman Old Style" w:eastAsia="Times New Roman" w:hAnsi="Bookman Old Style" w:cs="Times New Roman"/>
-          <w:b/>
-          <w:bCs/>
-          <w:kern w:val="0"/>
-          <w:sz w:val="36"/>
-          <w:szCs w:val="36"/>
-          <w:lang w:val="en-US"/>
-          <w14:ligatures w14:val="none"/>
-        </w:rPr>
-        <w:t xml:space="preserve">DESA </w:t>
-      </w:r>
-      <w:r>
-        <w:rPr>
-          <w:rFonts w:ascii="Bookman Old Style" w:eastAsia="Times New Roman" w:hAnsi="Bookman Old Style" w:cs="Times New Roman"/>
-          <w:b/>
-          <w:bCs/>
-          <w:kern w:val="0"/>
-          <w:sz w:val="36"/>
-          <w:szCs w:val="36"/>
-          <w:lang w:val="en-US"/>
-          <w14:ligatures w14:val="none"/>
-        </w:rPr>
-        <w:t>{</w:t>
-      </w:r>
-      <w:r>
-        <w:rPr>
-          <w:rFonts w:ascii="Bookman Old Style" w:eastAsia="Times New Roman" w:hAnsi="Bookman Old Style" w:cs="Times New Roman"/>
-          <w:b/>
-          <w:bCs/>
-          <w:kern w:val="0"/>
-          <w:sz w:val="36"/>
-          <w:szCs w:val="36"/>
-          <w:lang w:val="en-US"/>
-          <w14:ligatures w14:val="none"/>
-        </w:rPr>
-        <w:t>nama_desa</w:t>
-      </w:r>
-      <w:r>
-        <w:rPr>
-          <w:rFonts w:ascii="Bookman Old Style" w:eastAsia="Times New Roman" w:hAnsi="Bookman Old Style" w:cs="Times New Roman"/>
-          <w:b/>
-          <w:bCs/>
-          <w:kern w:val="0"/>
-          <w:sz w:val="36"/>
-          <w:szCs w:val="36"/>
-          <w:lang w:val="en-US"/>
-          <w14:ligatures w14:val="none"/>
-        </w:rPr>
-        <w:t>}</w:t>
-      </w:r>
-    </w:p>
-    <w:p>
-      <w:pPr>
-        <w:suppressAutoHyphens/>
-        <w:autoSpaceDN w:val="0"/>
-        <w:spacing w:after="0" w:line="240" w:lineRule="auto"/>
-        <w:jc w:val="center"/>
-        <w:rPr>
-          <w:rFonts w:ascii="Bookman Old Style" w:eastAsia="Times New Roman" w:hAnsi="Bookman Old Style" w:cs="Times New Roman"/>
-          <w:kern w:val="0"/>
+          <w:caps w:val="0"/>
           <w:sz w:val="20"/>
           <w:szCs w:val="20"/>
-          <w:lang w:val="en-US"/>
-          <w14:ligatures w14:val="none"/>
-        </w:rPr>
-      </w:pPr>
-      <w:r>
-        <w:rPr>
-          <w:rFonts w:ascii="Bookman Old Style" w:eastAsia="Times New Roman" w:hAnsi="Bookman Old Style" w:cs="Times New Roman"/>
-          <w:kern w:val="0"/>
-          <w:sz w:val="20"/>
-          <w:szCs w:val="20"/>
-          <w:lang w:val="en-US"/>
-          <w14:ligatures w14:val="none"/>
-        </w:rPr>
-        <w:t>{</w:t>
-      </w:r>
-      <w:r>
-        <w:rPr>
-          <w:rFonts w:ascii="Bookman Old Style" w:eastAsia="Times New Roman" w:hAnsi="Bookman Old Style" w:cs="Times New Roman"/>
-          <w:kern w:val="0"/>
-          <w:sz w:val="20"/>
-          <w:szCs w:val="20"/>
-          <w:lang w:val="en-US"/>
-          <w14:ligatures w14:val="none"/>
-        </w:rPr>
-        <w:t>alamat_desa</w:t>
-      </w:r>
-      <w:r>
-        <w:rPr>
-          <w:rFonts w:ascii="Bookman Old Style" w:eastAsia="Times New Roman" w:hAnsi="Bookman Old Style" w:cs="Times New Roman"/>
-          <w:kern w:val="0"/>
-          <w:sz w:val="20"/>
-          <w:szCs w:val="20"/>
-          <w:lang w:val="en-US"/>
-          <w14:ligatures w14:val="none"/>
-        </w:rPr>
-        <w:t>}</w:t>
-      </w:r>
-      <w:r>
-        <w:rPr>
-          <w:rFonts w:ascii="Bookman Old Style" w:eastAsia="Times New Roman" w:hAnsi="Bookman Old Style" w:cs="Times New Roman"/>
-          <w:kern w:val="0"/>
-          <w:sz w:val="20"/>
-          <w:szCs w:val="20"/>
-          <w:lang w:val="en-US"/>
-          <w14:ligatures w14:val="none"/>
-        </w:rPr>
-        <w:t>,</w:t>
-      </w:r>
-      <w:r>
-        <w:rPr>
-          <w:rFonts w:ascii="Bookman Old Style" w:eastAsia="Times New Roman" w:hAnsi="Bookman Old Style" w:cs="Times New Roman"/>
-          <w:kern w:val="0"/>
-          <w:sz w:val="20"/>
-          <w:szCs w:val="20"/>
-          <w:lang w:val="en-US"/>
-          <w14:ligatures w14:val="none"/>
-        </w:rPr>
-        <w:t xml:space="preserve"> </w:t>
-      </w:r>
-      <w:r>
-        <w:rPr>
-          <w:rFonts w:ascii="Bookman Old Style" w:eastAsia="Times New Roman" w:hAnsi="Bookman Old Style" w:cs="Times New Roman"/>
-          <w:kern w:val="0"/>
-          <w:sz w:val="20"/>
-          <w:szCs w:val="20"/>
-          <w:lang w:val="en-US"/>
-          <w14:ligatures w14:val="none"/>
-        </w:rPr>
-        <w:t xml:space="preserve">Kode Pos : </w:t>
-      </w:r>
-      <w:r>
-        <w:rPr>
-          <w:rFonts w:ascii="Bookman Old Style" w:eastAsia="Times New Roman" w:hAnsi="Bookman Old Style" w:cs="Times New Roman"/>
-          <w:kern w:val="0"/>
-          <w:sz w:val="20"/>
-          <w:szCs w:val="20"/>
-          <w:lang w:val="en-US"/>
-          <w14:ligatures w14:val="none"/>
-        </w:rPr>
-        <w:t>{</w:t>
-      </w:r>
-      <w:r>
-        <w:rPr>
-          <w:rFonts w:ascii="Bookman Old Style" w:eastAsia="Times New Roman" w:hAnsi="Bookman Old Style" w:cs="Times New Roman"/>
-          <w:kern w:val="0"/>
-          <w:sz w:val="20"/>
-          <w:szCs w:val="20"/>
-          <w:lang w:val="en-US"/>
-          <w14:ligatures w14:val="none"/>
-        </w:rPr>
-        <w:t>kode_pos_desa</w:t>
-      </w:r>
-      <w:r>
-        <w:rPr>
-          <w:rFonts w:ascii="Bookman Old Style" w:eastAsia="Times New Roman" w:hAnsi="Bookman Old Style" w:cs="Times New Roman"/>
-          <w:kern w:val="0"/>
-          <w:sz w:val="20"/>
-          <w:szCs w:val="20"/>
-          <w:lang w:val="en-US"/>
-          <w14:ligatures w14:val="none"/>
-        </w:rPr>
-        <w:t>}</w:t>
-      </w:r>
-    </w:p>
-    <w:p>
-      <w:pPr>
-        <w:suppressAutoHyphens/>
-        <w:autoSpaceDN w:val="0"/>
-        <w:spacing w:after="0" w:line="240" w:lineRule="auto"/>
-        <w:jc w:val="center"/>
-        <w:rPr>
-          <w:rFonts w:ascii="Bookman Old Style" w:eastAsia="Times New Roman" w:hAnsi="Bookman Old Style" w:cs="Times New Roman"/>
-          <w:kern w:val="0"/>
-          <w:sz w:val="20"/>
-          <w:szCs w:val="20"/>
-          <w:lang w:val="en-US"/>
-          <w14:ligatures w14:val="none"/>
-        </w:rPr>
-      </w:pPr>
-      <w:r>
-        <w:rPr>
-          <w:rFonts w:ascii="Bookman Old Style" w:eastAsia="Times New Roman" w:hAnsi="Bookman Old Style" w:cs="Times New Roman"/>
-          <w:kern w:val="0"/>
-          <w:sz w:val="20"/>
-          <w:szCs w:val="20"/>
-          <w:lang w:val="en-US"/>
-          <w14:ligatures w14:val="none"/>
-        </w:rPr>
-        <w:t xml:space="preserve">Telp : </w:t>
-      </w:r>
-      <w:r>
-        <w:rPr>
-          <w:rFonts w:ascii="Bookman Old Style" w:eastAsia="Times New Roman" w:hAnsi="Bookman Old Style" w:cs="Times New Roman"/>
-          <w:kern w:val="0"/>
-          <w:sz w:val="20"/>
-          <w:szCs w:val="20"/>
-          <w:lang w:val="en-US"/>
-          <w14:ligatures w14:val="none"/>
-        </w:rPr>
-        <w:t>{</w:t>
-      </w:r>
-      <w:r>
-        <w:rPr>
-          <w:rFonts w:ascii="Bookman Old Style" w:eastAsia="Times New Roman" w:hAnsi="Bookman Old Style" w:cs="Times New Roman"/>
-          <w:kern w:val="0"/>
-          <w:sz w:val="20"/>
-          <w:szCs w:val="20"/>
-          <w:lang w:val="en-US"/>
-          <w14:ligatures w14:val="none"/>
-        </w:rPr>
-        <w:t>telp_desa</w:t>
-      </w:r>
-      <w:r>
-        <w:rPr>
-          <w:rFonts w:ascii="Bookman Old Style" w:eastAsia="Times New Roman" w:hAnsi="Bookman Old Style" w:cs="Times New Roman"/>
-          <w:kern w:val="0"/>
-          <w:sz w:val="20"/>
-          <w:szCs w:val="20"/>
-          <w:lang w:val="en-US"/>
-          <w14:ligatures w14:val="none"/>
-        </w:rPr>
-        <w:t>}</w:t>
-      </w:r>
-      <w:r>
-        <w:rPr>
-          <w:rFonts w:ascii="Bookman Old Style" w:eastAsia="Times New Roman" w:hAnsi="Bookman Old Style" w:cs="Times New Roman"/>
-          <w:kern w:val="0"/>
-          <w:sz w:val="20"/>
-          <w:szCs w:val="20"/>
-          <w:lang w:val="en-US"/>
-          <w14:ligatures w14:val="none"/>
-        </w:rPr>
-        <w:t xml:space="preserve"> </w:t>
-      </w:r>
-      <w:r>
-        <w:rPr>
-          <w:rFonts w:ascii="Bookman Old Style" w:eastAsia="Times New Roman" w:hAnsi="Bookman Old Style" w:cs="Times New Roman"/>
-          <w:kern w:val="0"/>
-          <w:sz w:val="20"/>
-          <w:szCs w:val="20"/>
-          <w:lang w:val="en-US"/>
-          <w14:ligatures w14:val="none"/>
-        </w:rPr>
-        <w:t xml:space="preserve">E-Mail : </w:t>
-      </w:r>
-      <w:r>
-        <w:rPr>
-          <w:rFonts w:ascii="Bookman Old Style" w:eastAsia="Times New Roman" w:hAnsi="Bookman Old Style" w:cs="Times New Roman"/>
-          <w:kern w:val="0"/>
-          <w:sz w:val="20"/>
-          <w:szCs w:val="20"/>
-          <w:lang w:val="en-US"/>
-          <w14:ligatures w14:val="none"/>
-        </w:rPr>
-        <w:t>{</w:t>
-      </w:r>
-      <w:r>
-        <w:rPr>
-          <w:rFonts w:ascii="Bookman Old Style" w:eastAsia="Times New Roman" w:hAnsi="Bookman Old Style" w:cs="Times New Roman"/>
-          <w:kern w:val="0"/>
-          <w:sz w:val="20"/>
-          <w:szCs w:val="20"/>
-          <w:lang w:val="en-US"/>
-          <w14:ligatures w14:val="none"/>
-        </w:rPr>
-        <w:t>email_desa</w:t>
-      </w:r>
-      <w:r>
-        <w:rPr>
-          <w:rFonts w:ascii="Bookman Old Style" w:eastAsia="Times New Roman" w:hAnsi="Bookman Old Style" w:cs="Times New Roman"/>
-          <w:kern w:val="0"/>
-          <w:sz w:val="20"/>
-          <w:szCs w:val="20"/>
-          <w:lang w:val="en-US"/>
-          <w14:ligatures w14:val="none"/>
-        </w:rPr>
-        <w:t>}</w:t>
-      </w:r>
-    </w:p>
-    <w:p>
-      <w:pPr>
-        <w:pBdr>
-          <w:bottom w:val="single" w:sz="36" w:space="1" w:color="auto"/>
-        </w:pBdr>
-        <w:suppressAutoHyphens/>
-        <w:autoSpaceDN w:val="0"/>
-        <w:spacing w:after="0" w:line="120" w:lineRule="auto"/>
-        <w:jc w:val="center"/>
-        <w:rPr>
-          <w:rFonts w:ascii="Bookman Old Style" w:eastAsia="Times New Roman" w:hAnsi="Bookman Old Style" w:cs="Times New Roman"/>
-          <w:kern w:val="0"/>
-          <w:sz w:val="20"/>
-          <w:lang w:val="en-US"/>
-          <w14:ligatures w14:val="none"/>
-        </w:rPr>
-      </w:pPr>
-    </w:p>
-    <w:p>
-      <w:pPr>
-        <w:keepNext/>
-        <w:suppressAutoHyphens/>
-        <w:autoSpaceDN w:val="0"/>
-        <w:spacing w:after="0" w:line="240" w:lineRule="auto"/>
-        <w:jc w:val="center"/>
-        <w:outlineLvl w:val="2"/>
-        <w:rPr>
-          <w:rFonts w:ascii="Bookman Old Style" w:eastAsia="Times New Roman" w:hAnsi="Bookman Old Style" w:cs="Times New Roman"/>
-          <w:b/>
-          <w:bCs/>
-          <w:kern w:val="0"/>
-          <w:sz w:val="34"/>
-          <w:szCs w:val="34"/>
-          <w:u w:val="single"/>
-          <w:lang w:val="en-US"/>
-          <w14:ligatures w14:val="none"/>
         </w:rPr>
       </w:pPr>
     </w:p>
@@ -6659,7 +5974,34 @@
                 <w:sz w:val="24"/>
                 <w:szCs w:val="24"/>
               </w:rPr>
-              <w:t>Yang bertandatangan  di bawah ini</w:t>
+              <w:t xml:space="preserve">Yang </w:t>
+            </w:r>
+            <w:proofErr w:type="gramStart"/>
+            <w:r>
+              <w:rPr>
+                <w:rFonts w:ascii="Bookman Old Style" w:hAnsi="Bookman Old Style"/>
+                <w:sz w:val="24"/>
+                <w:szCs w:val="24"/>
+              </w:rPr>
+              <w:t>bertandatangan  di</w:t>
+            </w:r>
+            <w:proofErr w:type="gramEnd"/>
+            <w:r>
+              <w:rPr>
+                <w:rFonts w:ascii="Bookman Old Style" w:hAnsi="Bookman Old Style"/>
+                <w:sz w:val="24"/>
+                <w:szCs w:val="24"/>
+              </w:rPr>
+              <w:t xml:space="preserve"> bawah </w:t>
+            </w:r>
+            <w:proofErr w:type="gramStart"/>
+            <w:r>
+              <w:rPr>
+                <w:rFonts w:ascii="Bookman Old Style" w:hAnsi="Bookman Old Style"/>
+                <w:sz w:val="24"/>
+                <w:szCs w:val="24"/>
+              </w:rPr>
+              <w:t>ini</w:t>
             </w:r>
             <w:r>
               <w:rPr>
@@ -6669,6 +6011,7 @@
               </w:rPr>
               <w:t xml:space="preserve"> :</w:t>
             </w:r>
+            <w:proofErr w:type="gramEnd"/>
           </w:p>
         </w:tc>
       </w:tr>
@@ -7202,8 +6545,18 @@
                 <w:sz w:val="24"/>
                 <w:szCs w:val="24"/>
               </w:rPr>
-              <w:t>Telah melakukan perjalanan dinas pada :</w:t>
-            </w:r>
+              <w:t xml:space="preserve">Telah melakukan perjalanan dinas </w:t>
+            </w:r>
+            <w:proofErr w:type="gramStart"/>
+            <w:r>
+              <w:rPr>
+                <w:rFonts w:ascii="Bookman Old Style" w:hAnsi="Bookman Old Style"/>
+                <w:sz w:val="24"/>
+                <w:szCs w:val="24"/>
+              </w:rPr>
+              <w:t>pada :</w:t>
+            </w:r>
+            <w:proofErr w:type="gramEnd"/>
           </w:p>
         </w:tc>
       </w:tr>
@@ -7947,6 +7300,7 @@
                 <w:szCs w:val="24"/>
               </w:rPr>
             </w:pPr>
+            <w:proofErr w:type="gramStart"/>
             <w:r>
               <w:rPr>
                 <w:rFonts w:ascii="Bookman Old Style" w:hAnsi="Bookman Old Style"/>
@@ -7961,7 +7315,16 @@
                 <w:sz w:val="24"/>
                 <w:szCs w:val="24"/>
               </w:rPr>
-              <w:t xml:space="preserve"> : </w:t>
+              <w:t xml:space="preserve"> :</w:t>
+            </w:r>
+            <w:proofErr w:type="gramEnd"/>
+            <w:r>
+              <w:rPr>
+                <w:rFonts w:ascii="Bookman Old Style" w:hAnsi="Bookman Old Style"/>
+                <w:sz w:val="24"/>
+                <w:szCs w:val="24"/>
+              </w:rPr>
+              <w:t xml:space="preserve"> </w:t>
             </w:r>
           </w:p>
         </w:tc>
@@ -8178,41 +7541,26 @@
     </w:p>
     <w:p>
       <w:pPr>
-        <w:suppressAutoHyphens/>
-        <w:autoSpaceDN w:val="0"/>
-        <w:spacing w:after="0" w:line="240" w:lineRule="auto"/>
-        <w:jc w:val="center"/>
+        <w:pStyle w:val="HeaderSurat"/>
+        <w:ind w:left="0"/>
         <w:rPr>
-          <w:rFonts w:ascii="Bookman Old Style" w:eastAsia="Times New Roman" w:hAnsi="Bookman Old Style" w:cs="Times New Roman"/>
-          <w:caps/>
           <w:noProof/>
-          <w:kern w:val="0"/>
-          <w:sz w:val="32"/>
-          <w:szCs w:val="32"/>
-          <w:lang w:val="en-US"/>
-          <w14:ligatures w14:val="none"/>
         </w:rPr>
       </w:pPr>
       <w:r>
         <w:rPr>
-          <w:rFonts w:ascii="Bookman Old Style" w:eastAsia="Times New Roman" w:hAnsi="Bookman Old Style" w:cs="Times New Roman"/>
-          <w:caps/>
+          <w:caps w:val="0"/>
           <w:noProof/>
-          <w:kern w:val="0"/>
-          <w:sz w:val="36"/>
-          <w:szCs w:val="36"/>
-          <w:lang w:val="en-US"/>
-          <w14:ligatures w14:val="none"/>
         </w:rPr>
         <w:lastRenderedPageBreak/>
         <w:drawing>
-          <wp:anchor distT="0" distB="0" distL="114300" distR="114300" simplePos="0" relativeHeight="251661312" behindDoc="1" locked="0" layoutInCell="1" allowOverlap="1" wp14:anchorId="3D22A3C8" wp14:editId="74F1F629">
+          <wp:anchor distT="0" distB="0" distL="114300" distR="114300" simplePos="0" relativeHeight="251661312" behindDoc="1" locked="0" layoutInCell="1" allowOverlap="1" wp14:anchorId="3D22A3C8" wp14:editId="6A286A66">
             <wp:simplePos x="0" y="0"/>
             <wp:positionH relativeFrom="column">
-              <wp:posOffset>-257176</wp:posOffset>
+              <wp:posOffset>-314960</wp:posOffset>
             </wp:positionH>
             <wp:positionV relativeFrom="paragraph">
-              <wp:posOffset>13334</wp:posOffset>
+              <wp:posOffset>-21326</wp:posOffset>
             </wp:positionV>
             <wp:extent cx="1076325" cy="1076325"/>
             <wp:effectExtent l="0" t="0" r="0" b="0"/>
@@ -8267,478 +7615,152 @@
       </w:r>
       <w:r>
         <w:rPr>
-          <w:rFonts w:ascii="Bookman Old Style" w:eastAsia="Times New Roman" w:hAnsi="Bookman Old Style" w:cs="Times New Roman"/>
-          <w:caps/>
           <w:noProof/>
-          <w:kern w:val="0"/>
-          <w:sz w:val="36"/>
-          <w:szCs w:val="36"/>
-          <w:lang w:val="en-US"/>
-          <w14:ligatures w14:val="none"/>
+        </w:rPr>
+        <w:t>PEMERINTAH KABUPATEN Magelang</w:t>
+      </w:r>
+    </w:p>
+    <w:p>
+      <w:pPr>
+        <w:pStyle w:val="HeaderSurat"/>
+        <w:ind w:left="0"/>
+      </w:pPr>
+      <w:r>
+        <w:t>KECAMATAN Borobudur</w:t>
+      </w:r>
+    </w:p>
+    <w:p>
+      <w:pPr>
+        <w:pStyle w:val="HeaderSurat"/>
+        <w:ind w:left="0"/>
+        <w:rPr>
+          <w:b/>
+          <w:bCs/>
+        </w:rPr>
+      </w:pPr>
+      <w:r>
+        <w:rPr>
+          <w:b/>
+          <w:bCs/>
+        </w:rPr>
+        <w:t>desa Kembanglimus</w:t>
+      </w:r>
+    </w:p>
+    <w:p>
+      <w:pPr>
+        <w:pStyle w:val="HeaderSurat"/>
+        <w:ind w:left="0"/>
+        <w:rPr>
+          <w:caps w:val="0"/>
+          <w:sz w:val="20"/>
+          <w:szCs w:val="20"/>
+        </w:rPr>
+      </w:pPr>
+      <w:r>
+        <w:rPr>
+          <w:caps w:val="0"/>
+          <w:sz w:val="20"/>
+          <w:szCs w:val="20"/>
+        </w:rPr>
+        <w:t xml:space="preserve">Jl. Sudirman KM. 03, Kembanglimus, Borobudur Kode </w:t>
+      </w:r>
+      <w:proofErr w:type="gramStart"/>
+      <w:r>
+        <w:rPr>
+          <w:caps w:val="0"/>
+          <w:sz w:val="20"/>
+          <w:szCs w:val="20"/>
+        </w:rPr>
+        <w:t>Pos :</w:t>
+      </w:r>
+      <w:proofErr w:type="gramEnd"/>
+      <w:r>
+        <w:rPr>
+          <w:caps w:val="0"/>
+          <w:sz w:val="20"/>
+          <w:szCs w:val="20"/>
+        </w:rPr>
+        <w:t xml:space="preserve"> 56553</w:t>
+      </w:r>
+    </w:p>
+    <w:p>
+      <w:pPr>
+        <w:pStyle w:val="HeaderSurat"/>
+        <w:pBdr>
+          <w:bottom w:val="thinThickThinMediumGap" w:sz="18" w:space="1" w:color="auto"/>
+        </w:pBdr>
+        <w:ind w:left="0"/>
+        <w:rPr>
+          <w:caps w:val="0"/>
+          <w:sz w:val="20"/>
+          <w:szCs w:val="20"/>
+        </w:rPr>
+      </w:pPr>
+      <w:proofErr w:type="gramStart"/>
+      <w:r>
+        <w:rPr>
+          <w:caps w:val="0"/>
+          <w:sz w:val="20"/>
+          <w:szCs w:val="20"/>
+        </w:rPr>
+        <w:t>Telp :</w:t>
+      </w:r>
+      <w:proofErr w:type="gramEnd"/>
+      <w:r>
+        <w:rPr>
+          <w:caps w:val="0"/>
+          <w:sz w:val="20"/>
+          <w:szCs w:val="20"/>
+        </w:rPr>
+        <w:t xml:space="preserve"> (0293) 7182286 </w:t>
+      </w:r>
+      <w:proofErr w:type="gramStart"/>
+      <w:r>
+        <w:rPr>
+          <w:caps w:val="0"/>
+          <w:sz w:val="20"/>
+          <w:szCs w:val="20"/>
+        </w:rPr>
+        <w:t>E-Mail :</w:t>
+      </w:r>
+      <w:proofErr w:type="gramEnd"/>
+      <w:r>
+        <w:rPr>
+          <w:caps w:val="0"/>
+          <w:sz w:val="20"/>
+          <w:szCs w:val="20"/>
         </w:rPr>
         <w:t xml:space="preserve"> </w:t>
       </w:r>
+      <w:hyperlink r:id="rId8" w:history="1">
+        <w:r>
+          <w:rPr>
+            <w:rStyle w:val="Hyperlink"/>
+            <w:rFonts w:eastAsiaTheme="majorEastAsia"/>
+            <w:caps w:val="0"/>
+            <w:sz w:val="20"/>
+            <w:szCs w:val="20"/>
+          </w:rPr>
+          <w:t>desakembanglimus1@gmail.com</w:t>
+        </w:r>
+      </w:hyperlink>
       <w:r>
         <w:rPr>
-          <w:rFonts w:ascii="Bookman Old Style" w:eastAsia="Times New Roman" w:hAnsi="Bookman Old Style" w:cs="Times New Roman"/>
-          <w:caps/>
-          <w:noProof/>
-          <w:kern w:val="0"/>
-          <w:sz w:val="32"/>
-          <w:szCs w:val="32"/>
-          <w:lang w:val="en-US"/>
-          <w14:ligatures w14:val="none"/>
+          <w:caps w:val="0"/>
+          <w:sz w:val="20"/>
+          <w:szCs w:val="20"/>
         </w:rPr>
-        <w:t xml:space="preserve">PEMERINTAH </w:t>
-      </w:r>
-      <w:r>
-        <w:rPr>
-          <w:rFonts w:ascii="Bookman Old Style" w:eastAsia="Times New Roman" w:hAnsi="Bookman Old Style" w:cs="Times New Roman"/>
-          <w:caps/>
-          <w:noProof/>
-          <w:kern w:val="0"/>
-          <w:sz w:val="32"/>
-          <w:szCs w:val="32"/>
-          <w:lang w:val="en-US"/>
-          <w14:ligatures w14:val="none"/>
-        </w:rPr>
-        <w:t xml:space="preserve">kabupaten </w:t>
-      </w:r>
-      <w:r>
-        <w:rPr>
-          <w:rFonts w:ascii="Bookman Old Style" w:eastAsia="Times New Roman" w:hAnsi="Bookman Old Style" w:cs="Times New Roman"/>
-          <w:noProof/>
-          <w:kern w:val="0"/>
-          <w:sz w:val="32"/>
-          <w:szCs w:val="32"/>
-          <w:lang w:val="en-US"/>
-          <w14:ligatures w14:val="none"/>
-        </w:rPr>
-        <w:t>{</w:t>
-      </w:r>
-      <w:r>
-        <w:rPr>
-          <w:rFonts w:ascii="Bookman Old Style" w:eastAsia="Times New Roman" w:hAnsi="Bookman Old Style" w:cs="Times New Roman"/>
-          <w:noProof/>
-          <w:kern w:val="0"/>
-          <w:sz w:val="32"/>
-          <w:szCs w:val="32"/>
-          <w:lang w:val="en-US"/>
-          <w14:ligatures w14:val="none"/>
-        </w:rPr>
-        <w:t>nama_kabupaten</w:t>
-      </w:r>
-      <w:r>
-        <w:rPr>
-          <w:rFonts w:ascii="Bookman Old Style" w:eastAsia="Times New Roman" w:hAnsi="Bookman Old Style" w:cs="Times New Roman"/>
-          <w:noProof/>
-          <w:kern w:val="0"/>
-          <w:sz w:val="32"/>
-          <w:szCs w:val="32"/>
-          <w:lang w:val="en-US"/>
-          <w14:ligatures w14:val="none"/>
-        </w:rPr>
-        <w:t>}</w:t>
+        <w:t xml:space="preserve"> </w:t>
       </w:r>
     </w:p>
     <w:p>
       <w:pPr>
-        <w:suppressAutoHyphens/>
-        <w:autoSpaceDN w:val="0"/>
-        <w:spacing w:after="0" w:line="240" w:lineRule="auto"/>
-        <w:jc w:val="center"/>
+        <w:pStyle w:val="HeaderSurat"/>
+        <w:ind w:left="0"/>
         <w:rPr>
-          <w:rFonts w:ascii="Bookman Old Style" w:eastAsia="Times New Roman" w:hAnsi="Bookman Old Style" w:cs="Times New Roman"/>
-          <w:caps/>
-          <w:kern w:val="0"/>
-          <w:sz w:val="32"/>
-          <w:szCs w:val="32"/>
-          <w:lang w:val="en-US"/>
-          <w14:ligatures w14:val="none"/>
-        </w:rPr>
-      </w:pPr>
-      <w:r>
-        <w:rPr>
-          <w:rFonts w:ascii="Bookman Old Style" w:eastAsia="Times New Roman" w:hAnsi="Bookman Old Style" w:cs="Times New Roman"/>
-          <w:kern w:val="0"/>
-          <w:sz w:val="32"/>
-          <w:szCs w:val="32"/>
-          <w:lang w:val="en-US"/>
-          <w14:ligatures w14:val="none"/>
-        </w:rPr>
-        <w:t xml:space="preserve">KECAMATAN </w:t>
-      </w:r>
-      <w:r>
-        <w:rPr>
-          <w:rFonts w:ascii="Bookman Old Style" w:eastAsia="Times New Roman" w:hAnsi="Bookman Old Style" w:cs="Times New Roman"/>
-          <w:kern w:val="0"/>
-          <w:sz w:val="32"/>
-          <w:szCs w:val="32"/>
-          <w:lang w:val="en-US"/>
-          <w14:ligatures w14:val="none"/>
-        </w:rPr>
-        <w:t>{</w:t>
-      </w:r>
-      <w:r>
-        <w:rPr>
-          <w:rFonts w:ascii="Bookman Old Style" w:eastAsia="Times New Roman" w:hAnsi="Bookman Old Style" w:cs="Times New Roman"/>
-          <w:kern w:val="0"/>
-          <w:sz w:val="32"/>
-          <w:szCs w:val="32"/>
-          <w:lang w:val="en-US"/>
-          <w14:ligatures w14:val="none"/>
-        </w:rPr>
-        <w:t>nama_kecamatan</w:t>
-      </w:r>
-      <w:r>
-        <w:rPr>
-          <w:rFonts w:ascii="Bookman Old Style" w:eastAsia="Times New Roman" w:hAnsi="Bookman Old Style" w:cs="Times New Roman"/>
-          <w:kern w:val="0"/>
-          <w:sz w:val="32"/>
-          <w:szCs w:val="32"/>
-          <w:lang w:val="en-US"/>
-          <w14:ligatures w14:val="none"/>
-        </w:rPr>
-        <w:t>}</w:t>
-      </w:r>
-    </w:p>
-    <w:p>
-      <w:pPr>
-        <w:suppressAutoHyphens/>
-        <w:autoSpaceDN w:val="0"/>
-        <w:spacing w:after="0" w:line="240" w:lineRule="auto"/>
-        <w:jc w:val="center"/>
-        <w:rPr>
-          <w:rFonts w:ascii="Bookman Old Style" w:eastAsia="Times New Roman" w:hAnsi="Bookman Old Style" w:cs="Times New Roman"/>
-          <w:b/>
-          <w:bCs/>
-          <w:caps/>
-          <w:kern w:val="0"/>
-          <w:sz w:val="36"/>
-          <w:szCs w:val="36"/>
-          <w:lang w:val="en-US"/>
-          <w14:ligatures w14:val="none"/>
-        </w:rPr>
-      </w:pPr>
-      <w:r>
-        <w:rPr>
-          <w:rFonts w:ascii="Bookman Old Style" w:eastAsia="Times New Roman" w:hAnsi="Bookman Old Style" w:cs="Times New Roman"/>
-          <w:b/>
-          <w:bCs/>
-          <w:kern w:val="0"/>
-          <w:sz w:val="36"/>
-          <w:szCs w:val="36"/>
-          <w:lang w:val="en-US"/>
-          <w14:ligatures w14:val="none"/>
-        </w:rPr>
-        <w:t xml:space="preserve"> DESA </w:t>
-      </w:r>
-      <w:r>
-        <w:rPr>
-          <w:rFonts w:ascii="Bookman Old Style" w:eastAsia="Times New Roman" w:hAnsi="Bookman Old Style" w:cs="Times New Roman"/>
-          <w:b/>
-          <w:bCs/>
-          <w:kern w:val="0"/>
-          <w:sz w:val="36"/>
-          <w:szCs w:val="36"/>
-          <w:lang w:val="en-US"/>
-          <w14:ligatures w14:val="none"/>
-        </w:rPr>
-        <w:t>{</w:t>
-      </w:r>
-      <w:r>
-        <w:rPr>
-          <w:rFonts w:ascii="Bookman Old Style" w:eastAsia="Times New Roman" w:hAnsi="Bookman Old Style" w:cs="Times New Roman"/>
-          <w:b/>
-          <w:bCs/>
-          <w:kern w:val="0"/>
-          <w:sz w:val="36"/>
-          <w:szCs w:val="36"/>
-          <w:lang w:val="en-US"/>
-          <w14:ligatures w14:val="none"/>
-        </w:rPr>
-        <w:t>nama_desa</w:t>
-      </w:r>
-      <w:r>
-        <w:rPr>
-          <w:rFonts w:ascii="Bookman Old Style" w:eastAsia="Times New Roman" w:hAnsi="Bookman Old Style" w:cs="Times New Roman"/>
-          <w:b/>
-          <w:bCs/>
-          <w:kern w:val="0"/>
-          <w:sz w:val="36"/>
-          <w:szCs w:val="36"/>
-          <w:lang w:val="en-US"/>
-          <w14:ligatures w14:val="none"/>
-        </w:rPr>
-        <w:t>}</w:t>
-      </w:r>
-    </w:p>
-    <w:p>
-      <w:pPr>
-        <w:suppressAutoHyphens/>
-        <w:autoSpaceDN w:val="0"/>
-        <w:spacing w:after="0" w:line="240" w:lineRule="auto"/>
-        <w:jc w:val="center"/>
-        <w:rPr>
-          <w:rFonts w:ascii="Bookman Old Style" w:eastAsia="Times New Roman" w:hAnsi="Bookman Old Style" w:cs="Times New Roman"/>
-          <w:kern w:val="0"/>
+          <w:caps w:val="0"/>
           <w:sz w:val="20"/>
           <w:szCs w:val="20"/>
-          <w:lang w:val="en-US"/>
-          <w14:ligatures w14:val="none"/>
-        </w:rPr>
-      </w:pPr>
-      <w:r>
-        <w:rPr>
-          <w:rFonts w:ascii="Bookman Old Style" w:eastAsia="Times New Roman" w:hAnsi="Bookman Old Style" w:cs="Times New Roman"/>
-          <w:kern w:val="0"/>
-          <w:sz w:val="20"/>
-          <w:szCs w:val="20"/>
-          <w:lang w:val="en-US"/>
-          <w14:ligatures w14:val="none"/>
-        </w:rPr>
-        <w:t>{</w:t>
-      </w:r>
-      <w:r>
-        <w:rPr>
-          <w:rFonts w:ascii="Bookman Old Style" w:eastAsia="Times New Roman" w:hAnsi="Bookman Old Style" w:cs="Times New Roman"/>
-          <w:kern w:val="0"/>
-          <w:sz w:val="20"/>
-          <w:szCs w:val="20"/>
-          <w:lang w:val="en-US"/>
-          <w14:ligatures w14:val="none"/>
-        </w:rPr>
-        <w:t>alamat_desa</w:t>
-      </w:r>
-      <w:r>
-        <w:rPr>
-          <w:rFonts w:ascii="Bookman Old Style" w:eastAsia="Times New Roman" w:hAnsi="Bookman Old Style" w:cs="Times New Roman"/>
-          <w:kern w:val="0"/>
-          <w:sz w:val="20"/>
-          <w:szCs w:val="20"/>
-          <w:lang w:val="en-US"/>
-          <w14:ligatures w14:val="none"/>
-        </w:rPr>
-        <w:t>}</w:t>
-      </w:r>
-      <w:r>
-        <w:rPr>
-          <w:rFonts w:ascii="Bookman Old Style" w:eastAsia="Times New Roman" w:hAnsi="Bookman Old Style" w:cs="Times New Roman"/>
-          <w:kern w:val="0"/>
-          <w:sz w:val="20"/>
-          <w:szCs w:val="20"/>
-          <w:lang w:val="en-US"/>
-          <w14:ligatures w14:val="none"/>
-        </w:rPr>
-        <w:t>,</w:t>
-      </w:r>
-      <w:r>
-        <w:rPr>
-          <w:rFonts w:ascii="Bookman Old Style" w:eastAsia="Times New Roman" w:hAnsi="Bookman Old Style" w:cs="Times New Roman"/>
-          <w:kern w:val="0"/>
-          <w:sz w:val="20"/>
-          <w:szCs w:val="20"/>
-          <w:lang w:val="en-US"/>
-          <w14:ligatures w14:val="none"/>
-        </w:rPr>
-        <w:t xml:space="preserve"> </w:t>
-      </w:r>
-      <w:r>
-        <w:rPr>
-          <w:rFonts w:ascii="Bookman Old Style" w:eastAsia="Times New Roman" w:hAnsi="Bookman Old Style" w:cs="Times New Roman"/>
-          <w:kern w:val="0"/>
-          <w:sz w:val="20"/>
-          <w:szCs w:val="20"/>
-          <w:lang w:val="en-US"/>
-          <w14:ligatures w14:val="none"/>
-        </w:rPr>
-        <w:t xml:space="preserve">Kode Pos : </w:t>
-      </w:r>
-      <w:r>
-        <w:rPr>
-          <w:rFonts w:ascii="Bookman Old Style" w:eastAsia="Times New Roman" w:hAnsi="Bookman Old Style" w:cs="Times New Roman"/>
-          <w:kern w:val="0"/>
-          <w:sz w:val="20"/>
-          <w:szCs w:val="20"/>
-          <w:lang w:val="en-US"/>
-          <w14:ligatures w14:val="none"/>
-        </w:rPr>
-        <w:t>{</w:t>
-      </w:r>
-      <w:r>
-        <w:rPr>
-          <w:rFonts w:ascii="Bookman Old Style" w:eastAsia="Times New Roman" w:hAnsi="Bookman Old Style" w:cs="Times New Roman"/>
-          <w:kern w:val="0"/>
-          <w:sz w:val="20"/>
-          <w:szCs w:val="20"/>
-          <w:lang w:val="en-US"/>
-          <w14:ligatures w14:val="none"/>
-        </w:rPr>
-        <w:t>kode_pos_desa</w:t>
-      </w:r>
-      <w:r>
-        <w:rPr>
-          <w:rFonts w:ascii="Bookman Old Style" w:eastAsia="Times New Roman" w:hAnsi="Bookman Old Style" w:cs="Times New Roman"/>
-          <w:kern w:val="0"/>
-          <w:sz w:val="20"/>
-          <w:szCs w:val="20"/>
-          <w:lang w:val="en-US"/>
-          <w14:ligatures w14:val="none"/>
-        </w:rPr>
-        <w:t>}</w:t>
-      </w:r>
-    </w:p>
-    <w:p>
-      <w:pPr>
-        <w:suppressAutoHyphens/>
-        <w:autoSpaceDN w:val="0"/>
-        <w:spacing w:after="0" w:line="240" w:lineRule="auto"/>
-        <w:jc w:val="center"/>
-        <w:rPr>
-          <w:rFonts w:ascii="Bookman Old Style" w:eastAsia="Times New Roman" w:hAnsi="Bookman Old Style" w:cs="Times New Roman"/>
-          <w:kern w:val="0"/>
-          <w:sz w:val="20"/>
-          <w:szCs w:val="20"/>
-          <w:lang w:val="en-US"/>
-          <w14:ligatures w14:val="none"/>
-        </w:rPr>
-      </w:pPr>
-      <w:r>
-        <w:rPr>
-          <w:rFonts w:ascii="Bookman Old Style" w:eastAsia="Times New Roman" w:hAnsi="Bookman Old Style" w:cs="Times New Roman"/>
-          <w:kern w:val="0"/>
-          <w:sz w:val="20"/>
-          <w:szCs w:val="20"/>
-          <w:lang w:val="en-US"/>
-          <w14:ligatures w14:val="none"/>
-        </w:rPr>
-        <w:t xml:space="preserve">Telp : </w:t>
-      </w:r>
-      <w:r>
-        <w:rPr>
-          <w:rFonts w:ascii="Bookman Old Style" w:eastAsia="Times New Roman" w:hAnsi="Bookman Old Style" w:cs="Times New Roman"/>
-          <w:kern w:val="0"/>
-          <w:sz w:val="20"/>
-          <w:szCs w:val="20"/>
-          <w:lang w:val="en-US"/>
-          <w14:ligatures w14:val="none"/>
-        </w:rPr>
-        <w:t>{</w:t>
-      </w:r>
-      <w:r>
-        <w:rPr>
-          <w:rFonts w:ascii="Bookman Old Style" w:eastAsia="Times New Roman" w:hAnsi="Bookman Old Style" w:cs="Times New Roman"/>
-          <w:kern w:val="0"/>
-          <w:sz w:val="20"/>
-          <w:szCs w:val="20"/>
-          <w:lang w:val="en-US"/>
-          <w14:ligatures w14:val="none"/>
-        </w:rPr>
-        <w:t>telp_desa</w:t>
-      </w:r>
-      <w:r>
-        <w:rPr>
-          <w:rFonts w:ascii="Bookman Old Style" w:eastAsia="Times New Roman" w:hAnsi="Bookman Old Style" w:cs="Times New Roman"/>
-          <w:kern w:val="0"/>
-          <w:sz w:val="20"/>
-          <w:szCs w:val="20"/>
-          <w:lang w:val="en-US"/>
-          <w14:ligatures w14:val="none"/>
-        </w:rPr>
-        <w:t>}</w:t>
-      </w:r>
-      <w:r>
-        <w:rPr>
-          <w:rFonts w:ascii="Bookman Old Style" w:eastAsia="Times New Roman" w:hAnsi="Bookman Old Style" w:cs="Times New Roman"/>
-          <w:kern w:val="0"/>
-          <w:sz w:val="20"/>
-          <w:szCs w:val="20"/>
-          <w:lang w:val="en-US"/>
-          <w14:ligatures w14:val="none"/>
-        </w:rPr>
-        <w:t xml:space="preserve"> </w:t>
-      </w:r>
-      <w:r>
-        <w:rPr>
-          <w:rFonts w:ascii="Bookman Old Style" w:eastAsia="Times New Roman" w:hAnsi="Bookman Old Style" w:cs="Times New Roman"/>
-          <w:kern w:val="0"/>
-          <w:sz w:val="20"/>
-          <w:szCs w:val="20"/>
-          <w:lang w:val="en-US"/>
-          <w14:ligatures w14:val="none"/>
-        </w:rPr>
-        <w:t xml:space="preserve">E-Mail : </w:t>
-      </w:r>
-      <w:r>
-        <w:rPr>
-          <w:rFonts w:ascii="Bookman Old Style" w:eastAsia="Times New Roman" w:hAnsi="Bookman Old Style" w:cs="Times New Roman"/>
-          <w:kern w:val="0"/>
-          <w:sz w:val="20"/>
-          <w:szCs w:val="20"/>
-          <w:lang w:val="en-US"/>
-          <w14:ligatures w14:val="none"/>
-        </w:rPr>
-        <w:t>{</w:t>
-      </w:r>
-      <w:r>
-        <w:rPr>
-          <w:rFonts w:ascii="Bookman Old Style" w:eastAsia="Times New Roman" w:hAnsi="Bookman Old Style" w:cs="Times New Roman"/>
-          <w:kern w:val="0"/>
-          <w:sz w:val="20"/>
-          <w:szCs w:val="20"/>
-          <w:lang w:val="en-US"/>
-          <w14:ligatures w14:val="none"/>
-        </w:rPr>
-        <w:t>email_desa</w:t>
-      </w:r>
-      <w:r>
-        <w:rPr>
-          <w:rFonts w:ascii="Bookman Old Style" w:eastAsia="Times New Roman" w:hAnsi="Bookman Old Style" w:cs="Times New Roman"/>
-          <w:kern w:val="0"/>
-          <w:sz w:val="20"/>
-          <w:szCs w:val="20"/>
-          <w:lang w:val="en-US"/>
-          <w14:ligatures w14:val="none"/>
-        </w:rPr>
-        <w:t>}</w:t>
-      </w:r>
-    </w:p>
-    <w:p>
-      <w:pPr>
-        <w:pBdr>
-          <w:bottom w:val="single" w:sz="36" w:space="1" w:color="auto"/>
-        </w:pBdr>
-        <w:suppressAutoHyphens/>
-        <w:autoSpaceDN w:val="0"/>
-        <w:spacing w:after="0" w:line="120" w:lineRule="auto"/>
-        <w:jc w:val="center"/>
-        <w:rPr>
-          <w:rFonts w:ascii="Bookman Old Style" w:eastAsia="Times New Roman" w:hAnsi="Bookman Old Style" w:cs="Times New Roman"/>
-          <w:kern w:val="0"/>
-          <w:sz w:val="20"/>
-          <w:lang w:val="en-US"/>
-          <w14:ligatures w14:val="none"/>
-        </w:rPr>
-      </w:pPr>
-    </w:p>
-    <w:p>
-      <w:pPr>
-        <w:keepNext/>
-        <w:suppressAutoHyphens/>
-        <w:autoSpaceDN w:val="0"/>
-        <w:spacing w:after="0" w:line="240" w:lineRule="auto"/>
-        <w:jc w:val="center"/>
-        <w:outlineLvl w:val="2"/>
-        <w:rPr>
-          <w:rFonts w:ascii="Bookman Old Style" w:eastAsia="Times New Roman" w:hAnsi="Bookman Old Style" w:cs="Times New Roman"/>
-          <w:b/>
-          <w:bCs/>
-          <w:kern w:val="0"/>
-          <w:sz w:val="34"/>
-          <w:szCs w:val="34"/>
-          <w:u w:val="single"/>
-          <w:lang w:val="en-US"/>
-          <w14:ligatures w14:val="none"/>
         </w:rPr>
       </w:pPr>
     </w:p>
@@ -9651,7 +8673,25 @@
                 <w:sz w:val="24"/>
                 <w:szCs w:val="24"/>
               </w:rPr>
-              <w:t xml:space="preserve">Dilaksanakan Pada : </w:t>
+              <w:t xml:space="preserve">Dilaksanakan </w:t>
+            </w:r>
+            <w:proofErr w:type="gramStart"/>
+            <w:r>
+              <w:rPr>
+                <w:rFonts w:ascii="Bookman Old Style" w:hAnsi="Bookman Old Style"/>
+                <w:sz w:val="24"/>
+                <w:szCs w:val="24"/>
+              </w:rPr>
+              <w:t>Pada :</w:t>
+            </w:r>
+            <w:proofErr w:type="gramEnd"/>
+            <w:r>
+              <w:rPr>
+                <w:rFonts w:ascii="Bookman Old Style" w:hAnsi="Bookman Old Style"/>
+                <w:sz w:val="24"/>
+                <w:szCs w:val="24"/>
+              </w:rPr>
+              <w:t xml:space="preserve"> </w:t>
             </w:r>
           </w:p>
         </w:tc>
@@ -10747,7 +9787,21 @@
           <w:lang w:val="en-US"/>
           <w14:ligatures w14:val="none"/>
         </w:rPr>
-        <w:t>nama_kecamatan</w:t>
+        <w:t>nama_</w:t>
+      </w:r>
+      <w:proofErr w:type="gramStart"/>
+      <w:r>
+        <w:rPr>
+          <w:rFonts w:ascii="Bookman Old Style" w:eastAsia="Times New Roman" w:hAnsi="Bookman Old Style" w:cs="Times New Roman"/>
+          <w:b/>
+          <w:bCs/>
+          <w:kern w:val="0"/>
+          <w:sz w:val="28"/>
+          <w:szCs w:val="28"/>
+          <w:lang w:val="en-US"/>
+          <w14:ligatures w14:val="none"/>
+        </w:rPr>
+        <w:t>kecamatan</w:t>
       </w:r>
       <w:r>
         <w:rPr>
@@ -10762,6 +9816,7 @@
         </w:rPr>
         <w:t>}{</w:t>
       </w:r>
+      <w:proofErr w:type="gramEnd"/>
       <w:r>
         <w:rPr>
           <w:rFonts w:ascii="Bookman Old Style" w:eastAsia="Times New Roman" w:hAnsi="Bookman Old Style" w:cs="Times New Roman"/>
@@ -14310,6 +13365,39 @@
       </w:tblBorders>
     </w:tblPr>
   </w:style>
+  <w:style w:type="paragraph" w:customStyle="1" w:styleId="HeaderSurat">
+    <w:name w:val="Header Surat"/>
+    <w:basedOn w:val="Normal"/>
+    <w:rsid w:val="008D172E"/>
+    <w:pPr>
+      <w:suppressAutoHyphens/>
+      <w:autoSpaceDN w:val="0"/>
+      <w:spacing w:after="0" w:line="240" w:lineRule="auto"/>
+      <w:ind w:left="1560"/>
+      <w:jc w:val="center"/>
+      <w:textAlignment w:val="baseline"/>
+    </w:pPr>
+    <w:rPr>
+      <w:rFonts w:ascii="Bookman Old Style" w:eastAsia="Times New Roman" w:hAnsi="Bookman Old Style" w:cs="Times New Roman"/>
+      <w:caps/>
+      <w:kern w:val="0"/>
+      <w:sz w:val="36"/>
+      <w:szCs w:val="36"/>
+      <w:lang w:val="en-US"/>
+      <w14:ligatures w14:val="none"/>
+    </w:rPr>
+  </w:style>
+  <w:style w:type="character" w:styleId="Hyperlink">
+    <w:name w:val="Hyperlink"/>
+    <w:basedOn w:val="DefaultParagraphFont"/>
+    <w:uiPriority w:val="99"/>
+    <w:unhideWhenUsed/>
+    <w:rsid w:val="008D172E"/>
+    <w:rPr>
+      <w:color w:val="467886" w:themeColor="hyperlink"/>
+      <w:u w:val="single"/>
+    </w:rPr>
+  </w:style>
 </w:styles>
 </file>
 

</xml_diff>

<commit_message>
feat: enhance RAB search functionality with full Excel-DB integration and add module-specific UI scripts and templates
</commit_message>
<xml_diff>
--- a/templates/sppd_template.docx
+++ b/templates/sppd_template.docx
@@ -81,7 +81,13 @@
         <w:rPr>
           <w:noProof/>
         </w:rPr>
-        <w:t>PEMERINTAH KABUPATEN Magelang</w:t>
+        <w:t xml:space="preserve">PEMERINTAH </w:t>
+      </w:r>
+      <w:r>
+        <w:rPr>
+          <w:noProof/>
+        </w:rPr>
+        <w:t>kabupaten magelang</w:t>
       </w:r>
     </w:p>
     <w:p>
@@ -90,7 +96,7 @@
         <w:ind w:left="0"/>
       </w:pPr>
       <w:r>
-        <w:t>KECAMATAN Borobudur</w:t>
+        <w:t>kecamatan borobudur</w:t>
       </w:r>
     </w:p>
     <w:p>
@@ -107,7 +113,7 @@
           <w:b/>
           <w:bCs/>
         </w:rPr>
-        <w:t>desa Kembanglimus</w:t>
+        <w:t>DESA kembanglimus</w:t>
       </w:r>
     </w:p>
     <w:p>
@@ -176,7 +182,31 @@
           <w:sz w:val="20"/>
           <w:szCs w:val="20"/>
         </w:rPr>
-        <w:t xml:space="preserve"> (0293) 7182286 </w:t>
+        <w:t xml:space="preserve"> </w:t>
+      </w:r>
+      <w:r>
+        <w:rPr>
+          <w:caps w:val="0"/>
+          <w:sz w:val="20"/>
+          <w:szCs w:val="20"/>
+        </w:rPr>
+        <w:t xml:space="preserve">(0293) </w:t>
+      </w:r>
+      <w:r>
+        <w:rPr>
+          <w:caps w:val="0"/>
+          <w:sz w:val="20"/>
+          <w:szCs w:val="20"/>
+        </w:rPr>
+        <w:t>(0293) 7182286</w:t>
+      </w:r>
+      <w:r>
+        <w:rPr>
+          <w:caps w:val="0"/>
+          <w:sz w:val="20"/>
+          <w:szCs w:val="20"/>
+        </w:rPr>
+        <w:t xml:space="preserve"> </w:t>
       </w:r>
       <w:proofErr w:type="gramStart"/>
       <w:r>
@@ -196,18 +226,15 @@
         </w:rPr>
         <w:t xml:space="preserve"> </w:t>
       </w:r>
-      <w:hyperlink r:id="rId8" w:history="1">
-        <w:r>
-          <w:rPr>
-            <w:rStyle w:val="Hyperlink"/>
-            <w:rFonts w:eastAsiaTheme="majorEastAsia"/>
-            <w:caps w:val="0"/>
-            <w:sz w:val="20"/>
-            <w:szCs w:val="20"/>
-          </w:rPr>
-          <w:t>desakembanglimus1@gmail.com</w:t>
-        </w:r>
-      </w:hyperlink>
+      <w:r>
+        <w:rPr>
+          <w:rFonts w:eastAsiaTheme="majorEastAsia"/>
+          <w:caps w:val="0"/>
+          <w:sz w:val="20"/>
+          <w:szCs w:val="20"/>
+        </w:rPr>
+        <w:t>desakembanglimus1@gmail.com</w:t>
+      </w:r>
       <w:r>
         <w:rPr>
           <w:caps w:val="0"/>
@@ -5521,7 +5548,7 @@
         </w:rPr>
         <w:t xml:space="preserve"> </w:t>
       </w:r>
-      <w:hyperlink r:id="rId9" w:history="1">
+      <w:hyperlink r:id="rId8" w:history="1">
         <w:r>
           <w:rPr>
             <w:rStyle w:val="Hyperlink"/>
@@ -7732,7 +7759,7 @@
         </w:rPr>
         <w:t xml:space="preserve"> </w:t>
       </w:r>
-      <w:hyperlink r:id="rId10" w:history="1">
+      <w:hyperlink r:id="rId9" w:history="1">
         <w:r>
           <w:rPr>
             <w:rStyle w:val="Hyperlink"/>
@@ -11562,6 +11589,18 @@
       <w:szCs w:val="22"/>
     </w:rPr>
   </w:style>
+  <w:style w:type="character" w:styleId="UnresolvedMention">
+    <w:name w:val="Unresolved Mention"/>
+    <w:basedOn w:val="DefaultParagraphFont"/>
+    <w:uiPriority w:val="99"/>
+    <w:semiHidden/>
+    <w:unhideWhenUsed/>
+    <w:rsid w:val="004F67AA"/>
+    <w:rPr>
+      <w:color w:val="605E5C"/>
+      <w:shd w:val="clear" w:color="auto" w:fill="E1DFDD"/>
+    </w:rPr>
+  </w:style>
 </w:styles>
 </file>
 

</xml_diff>